<commit_message>
cambio a rutas absolutas
</commit_message>
<xml_diff>
--- a/Inputs/Templates/MF General.docx
+++ b/Inputs/Templates/MF General.docx
@@ -1171,7 +1171,6 @@
             <w:id w:val="-2119444129"/>
             <w:picture/>
           </w:sdtPr>
-          <w:sdtEndPr/>
           <w:sdtContent>
             <w:tc>
               <w:tcPr>
@@ -1262,7 +1261,6 @@
             <w:id w:val="-1544437031"/>
             <w:picture/>
           </w:sdtPr>
-          <w:sdtEndPr/>
           <w:sdtContent>
             <w:tc>
               <w:tcPr>
@@ -1353,7 +1351,6 @@
             <w:id w:val="880134221"/>
             <w:picture/>
           </w:sdtPr>
-          <w:sdtEndPr/>
           <w:sdtContent>
             <w:tc>
               <w:tcPr>
@@ -3838,7 +3835,6 @@
   <w:style w:type="character" w:default="1" w:styleId="Fuentedeprrafopredeter">
     <w:name w:val="Default Paragraph Font"/>
     <w:uiPriority w:val="1"/>
-    <w:semiHidden/>
     <w:unhideWhenUsed/>
   </w:style>
   <w:style w:type="table" w:default="1" w:styleId="Tablanormal">

</xml_diff>

<commit_message>
imagenes plan y lampara
</commit_message>
<xml_diff>
--- a/Inputs/Templates/MF General.docx
+++ b/Inputs/Templates/MF General.docx
@@ -274,6 +274,7 @@
             <w:pPr>
               <w:pStyle w:val="Default"/>
               <w:spacing w:line="360" w:lineRule="auto"/>
+              <w:jc w:val="both"/>
               <w:rPr>
                 <w:rFonts w:asciiTheme="minorHAnsi" w:hAnsiTheme="minorHAnsi" w:cstheme="minorHAnsi"/>
                 <w:color w:val="000000" w:themeColor="text1"/>
@@ -322,6 +323,47 @@
         </w:tc>
       </w:tr>
       <w:tr>
+        <w:trPr>
+          <w:trHeight w:val="57"/>
+        </w:trPr>
+        <w:tc>
+          <w:tcPr>
+            <w:tcW w:w="4414" w:type="dxa"/>
+            <w:vAlign w:val="center"/>
+          </w:tcPr>
+          <w:p>
+            <w:pPr>
+              <w:pStyle w:val="Default"/>
+              <w:jc w:val="both"/>
+              <w:rPr>
+                <w:rFonts w:asciiTheme="minorHAnsi" w:hAnsiTheme="minorHAnsi" w:cstheme="minorHAnsi"/>
+                <w:color w:val="000000" w:themeColor="text1"/>
+                <w:sz w:val="20"/>
+                <w:szCs w:val="20"/>
+              </w:rPr>
+            </w:pPr>
+          </w:p>
+        </w:tc>
+        <w:tc>
+          <w:tcPr>
+            <w:tcW w:w="4414" w:type="dxa"/>
+            <w:vAlign w:val="center"/>
+          </w:tcPr>
+          <w:p>
+            <w:pPr>
+              <w:pStyle w:val="Default"/>
+              <w:jc w:val="center"/>
+              <w:rPr>
+                <w:rFonts w:asciiTheme="minorHAnsi" w:hAnsiTheme="minorHAnsi" w:cstheme="minorHAnsi"/>
+                <w:color w:val="000000" w:themeColor="text1"/>
+                <w:sz w:val="20"/>
+                <w:szCs w:val="20"/>
+              </w:rPr>
+            </w:pPr>
+          </w:p>
+        </w:tc>
+      </w:tr>
+      <w:tr>
         <w:tc>
           <w:tcPr>
             <w:tcW w:w="4414" w:type="dxa"/>
@@ -331,6 +373,7 @@
             <w:pPr>
               <w:pStyle w:val="Default"/>
               <w:spacing w:line="360" w:lineRule="auto"/>
+              <w:jc w:val="both"/>
               <w:rPr>
                 <w:rFonts w:asciiTheme="minorHAnsi" w:hAnsiTheme="minorHAnsi" w:cstheme="minorHAnsi"/>
                 <w:color w:val="000000" w:themeColor="text1"/>
@@ -427,14 +470,6 @@
         <w:tblStyle w:val="Tablaconcuadrcula"/>
         <w:tblW w:w="0" w:type="auto"/>
         <w:tblInd w:w="-5" w:type="dxa"/>
-        <w:tblBorders>
-          <w:top w:val="none" w:sz="0" w:space="0" w:color="auto"/>
-          <w:left w:val="none" w:sz="0" w:space="0" w:color="auto"/>
-          <w:bottom w:val="none" w:sz="0" w:space="0" w:color="auto"/>
-          <w:right w:val="none" w:sz="0" w:space="0" w:color="auto"/>
-          <w:insideH w:val="none" w:sz="0" w:space="0" w:color="auto"/>
-          <w:insideV w:val="none" w:sz="0" w:space="0" w:color="auto"/>
-        </w:tblBorders>
         <w:tblLook w:val="04A0" w:firstRow="1" w:lastRow="0" w:firstColumn="1" w:lastColumn="0" w:noHBand="0" w:noVBand="1"/>
       </w:tblPr>
       <w:tblGrid>
@@ -572,6 +607,7 @@
             <w:pPr>
               <w:pStyle w:val="Default"/>
               <w:spacing w:line="360" w:lineRule="auto"/>
+              <w:jc w:val="both"/>
               <w:rPr>
                 <w:rFonts w:asciiTheme="minorHAnsi" w:hAnsiTheme="minorHAnsi" w:cstheme="minorHAnsi"/>
                 <w:color w:val="000000" w:themeColor="text1"/>
@@ -632,6 +668,47 @@
       </w:tr>
       <w:tr>
         <w:trPr>
+          <w:trHeight w:val="57"/>
+        </w:trPr>
+        <w:tc>
+          <w:tcPr>
+            <w:tcW w:w="4416" w:type="dxa"/>
+            <w:vAlign w:val="center"/>
+          </w:tcPr>
+          <w:p>
+            <w:pPr>
+              <w:pStyle w:val="Default"/>
+              <w:jc w:val="both"/>
+              <w:rPr>
+                <w:rFonts w:asciiTheme="minorHAnsi" w:hAnsiTheme="minorHAnsi" w:cstheme="minorHAnsi"/>
+                <w:color w:val="000000" w:themeColor="text1"/>
+                <w:sz w:val="20"/>
+                <w:szCs w:val="20"/>
+              </w:rPr>
+            </w:pPr>
+          </w:p>
+        </w:tc>
+        <w:tc>
+          <w:tcPr>
+            <w:tcW w:w="4417" w:type="dxa"/>
+            <w:vAlign w:val="center"/>
+          </w:tcPr>
+          <w:p>
+            <w:pPr>
+              <w:pStyle w:val="Default"/>
+              <w:jc w:val="center"/>
+              <w:rPr>
+                <w:rFonts w:asciiTheme="minorHAnsi" w:hAnsiTheme="minorHAnsi" w:cstheme="minorHAnsi"/>
+                <w:color w:val="000000" w:themeColor="text1"/>
+                <w:sz w:val="20"/>
+                <w:szCs w:val="20"/>
+              </w:rPr>
+            </w:pPr>
+          </w:p>
+        </w:tc>
+      </w:tr>
+      <w:tr>
+        <w:trPr>
           <w:trHeight w:val="668"/>
         </w:trPr>
         <w:tc>
@@ -643,6 +720,7 @@
             <w:pPr>
               <w:pStyle w:val="Default"/>
               <w:spacing w:line="360" w:lineRule="auto"/>
+              <w:jc w:val="both"/>
               <w:rPr>
                 <w:rFonts w:asciiTheme="minorHAnsi" w:hAnsiTheme="minorHAnsi" w:cstheme="minorHAnsi"/>
                 <w:color w:val="000000" w:themeColor="text1"/>
@@ -746,6 +824,7 @@
             <w:pPr>
               <w:pStyle w:val="Default"/>
               <w:spacing w:line="360" w:lineRule="auto"/>
+              <w:jc w:val="both"/>
               <w:rPr>
                 <w:rFonts w:asciiTheme="minorHAnsi" w:hAnsiTheme="minorHAnsi" w:cstheme="minorHAnsi"/>
                 <w:color w:val="000000" w:themeColor="text1"/>
@@ -861,15 +940,16 @@
         <w:tblLook w:val="04A0" w:firstRow="1" w:lastRow="0" w:firstColumn="1" w:lastColumn="0" w:noHBand="0" w:noVBand="1"/>
       </w:tblPr>
       <w:tblGrid>
-        <w:gridCol w:w="2947"/>
-        <w:gridCol w:w="2948"/>
-        <w:gridCol w:w="2948"/>
+        <w:gridCol w:w="2977"/>
+        <w:gridCol w:w="2717"/>
+        <w:gridCol w:w="451"/>
+        <w:gridCol w:w="2688"/>
       </w:tblGrid>
       <w:tr>
         <w:tc>
           <w:tcPr>
             <w:tcW w:w="8833" w:type="dxa"/>
-            <w:gridSpan w:val="3"/>
+            <w:gridSpan w:val="4"/>
           </w:tcPr>
           <w:p>
             <w:pPr>
@@ -929,279 +1009,130 @@
         <w:trPr>
           <w:trHeight w:val="3062"/>
         </w:trPr>
-        <w:sdt>
-          <w:sdtPr>
-            <w:rPr>
-              <w:rFonts w:asciiTheme="minorHAnsi" w:hAnsiTheme="minorHAnsi" w:cstheme="minorHAnsi"/>
-              <w:color w:val="000000" w:themeColor="text1"/>
-              <w:sz w:val="22"/>
-              <w:szCs w:val="22"/>
-            </w:rPr>
-            <w:id w:val="-2119444129"/>
-            <w:picture/>
-          </w:sdtPr>
-          <w:sdtEndPr/>
-          <w:sdtContent>
-            <w:tc>
-              <w:tcPr>
-                <w:tcW w:w="3428" w:type="dxa"/>
-                <w:vAlign w:val="center"/>
-              </w:tcPr>
-              <w:p>
-                <w:pPr>
-                  <w:pStyle w:val="Default"/>
-                  <w:spacing w:line="360" w:lineRule="auto"/>
-                  <w:ind w:right="2034"/>
-                  <w:jc w:val="center"/>
-                  <w:rPr>
-                    <w:rFonts w:asciiTheme="minorHAnsi" w:hAnsiTheme="minorHAnsi" w:cstheme="minorHAnsi"/>
-                    <w:color w:val="000000" w:themeColor="text1"/>
-                    <w:sz w:val="22"/>
-                    <w:szCs w:val="22"/>
-                  </w:rPr>
-                </w:pPr>
-                <w:r>
-                  <w:rPr>
-                    <w:rFonts w:asciiTheme="minorHAnsi" w:hAnsiTheme="minorHAnsi" w:cstheme="minorHAnsi"/>
-                    <w:noProof/>
-                    <w:color w:val="000000" w:themeColor="text1"/>
-                    <w:sz w:val="22"/>
-                    <w:szCs w:val="22"/>
-                  </w:rPr>
-                  <w:drawing>
-                    <wp:inline distT="0" distB="0" distL="0" distR="0" wp14:anchorId="19C080A6" wp14:editId="067FFBA1">
-                      <wp:extent cx="1800000" cy="1350000"/>
-                      <wp:effectExtent l="0" t="0" r="0" b="3175"/>
-                      <wp:docPr id="6" name="Imagen 3"/>
-                      <wp:cNvGraphicFramePr>
-                        <a:graphicFrameLocks xmlns:a="http://schemas.openxmlformats.org/drawingml/2006/main" noChangeAspect="1"/>
-                      </wp:cNvGraphicFramePr>
-                      <a:graphic xmlns:a="http://schemas.openxmlformats.org/drawingml/2006/main">
-                        <a:graphicData uri="http://schemas.openxmlformats.org/drawingml/2006/picture">
-                          <pic:pic xmlns:pic="http://schemas.openxmlformats.org/drawingml/2006/picture">
-                            <pic:nvPicPr>
-                              <pic:cNvPr id="6" name="Imagen 3"/>
-                              <pic:cNvPicPr>
-                                <a:picLocks noChangeAspect="1" noChangeArrowheads="1"/>
-                              </pic:cNvPicPr>
-                            </pic:nvPicPr>
-                            <pic:blipFill>
-                              <a:blip r:embed="rId7" cstate="print">
-                                <a:extLst>
-                                  <a:ext uri="{28A0092B-C50C-407E-A947-70E740481C1C}">
-                                    <a14:useLocalDpi xmlns:a14="http://schemas.microsoft.com/office/drawing/2010/main" val="0"/>
-                                  </a:ext>
-                                </a:extLst>
-                              </a:blip>
-                              <a:stretch>
-                                <a:fillRect/>
-                              </a:stretch>
-                            </pic:blipFill>
-                            <pic:spPr bwMode="auto">
-                              <a:xfrm>
-                                <a:off x="0" y="0"/>
-                                <a:ext cx="1800000" cy="1350000"/>
-                              </a:xfrm>
-                              <a:prstGeom prst="rect">
-                                <a:avLst/>
-                              </a:prstGeom>
-                              <a:noFill/>
-                              <a:ln>
-                                <a:noFill/>
-                              </a:ln>
-                            </pic:spPr>
-                          </pic:pic>
-                        </a:graphicData>
-                      </a:graphic>
-                    </wp:inline>
-                  </w:drawing>
-                </w:r>
-              </w:p>
-            </w:tc>
-          </w:sdtContent>
-        </w:sdt>
-        <w:sdt>
-          <w:sdtPr>
-            <w:rPr>
-              <w:rFonts w:asciiTheme="minorHAnsi" w:hAnsiTheme="minorHAnsi" w:cstheme="minorHAnsi"/>
-              <w:color w:val="000000" w:themeColor="text1"/>
-              <w:sz w:val="22"/>
-              <w:szCs w:val="22"/>
-            </w:rPr>
-            <w:id w:val="-1544437031"/>
-            <w:picture/>
-          </w:sdtPr>
-          <w:sdtEndPr/>
-          <w:sdtContent>
-            <w:tc>
-              <w:tcPr>
-                <w:tcW w:w="2717" w:type="dxa"/>
-                <w:vAlign w:val="center"/>
-              </w:tcPr>
-              <w:p>
-                <w:pPr>
-                  <w:pStyle w:val="Default"/>
-                  <w:spacing w:line="360" w:lineRule="auto"/>
-                  <w:ind w:right="2034"/>
-                  <w:jc w:val="center"/>
-                  <w:rPr>
-                    <w:rFonts w:asciiTheme="minorHAnsi" w:hAnsiTheme="minorHAnsi" w:cstheme="minorHAnsi"/>
-                    <w:color w:val="000000" w:themeColor="text1"/>
-                    <w:sz w:val="22"/>
-                    <w:szCs w:val="22"/>
-                  </w:rPr>
-                </w:pPr>
-                <w:r>
-                  <w:rPr>
-                    <w:rFonts w:asciiTheme="minorHAnsi" w:hAnsiTheme="minorHAnsi" w:cstheme="minorHAnsi"/>
-                    <w:noProof/>
-                    <w:color w:val="000000" w:themeColor="text1"/>
-                    <w:sz w:val="22"/>
-                    <w:szCs w:val="22"/>
-                  </w:rPr>
-                  <w:drawing>
-                    <wp:inline distT="0" distB="0" distL="0" distR="0" wp14:anchorId="6480D7B8" wp14:editId="2AFB51DB">
-                      <wp:extent cx="1800000" cy="1350000"/>
-                      <wp:effectExtent l="0" t="0" r="0" b="3175"/>
-                      <wp:docPr id="7" name="Imagen 4"/>
-                      <wp:cNvGraphicFramePr>
-                        <a:graphicFrameLocks xmlns:a="http://schemas.openxmlformats.org/drawingml/2006/main" noChangeAspect="1"/>
-                      </wp:cNvGraphicFramePr>
-                      <a:graphic xmlns:a="http://schemas.openxmlformats.org/drawingml/2006/main">
-                        <a:graphicData uri="http://schemas.openxmlformats.org/drawingml/2006/picture">
-                          <pic:pic xmlns:pic="http://schemas.openxmlformats.org/drawingml/2006/picture">
-                            <pic:nvPicPr>
-                              <pic:cNvPr id="7" name="Imagen 4"/>
-                              <pic:cNvPicPr>
-                                <a:picLocks noChangeAspect="1" noChangeArrowheads="1"/>
-                              </pic:cNvPicPr>
-                            </pic:nvPicPr>
-                            <pic:blipFill>
-                              <a:blip r:embed="rId8" cstate="print">
-                                <a:extLst>
-                                  <a:ext uri="{28A0092B-C50C-407E-A947-70E740481C1C}">
-                                    <a14:useLocalDpi xmlns:a14="http://schemas.microsoft.com/office/drawing/2010/main" val="0"/>
-                                  </a:ext>
-                                </a:extLst>
-                              </a:blip>
-                              <a:stretch>
-                                <a:fillRect/>
-                              </a:stretch>
-                            </pic:blipFill>
-                            <pic:spPr bwMode="auto">
-                              <a:xfrm>
-                                <a:off x="0" y="0"/>
-                                <a:ext cx="1800000" cy="1350000"/>
-                              </a:xfrm>
-                              <a:prstGeom prst="rect">
-                                <a:avLst/>
-                              </a:prstGeom>
-                              <a:noFill/>
-                              <a:ln>
-                                <a:noFill/>
-                              </a:ln>
-                            </pic:spPr>
-                          </pic:pic>
-                        </a:graphicData>
-                      </a:graphic>
-                    </wp:inline>
-                  </w:drawing>
-                </w:r>
-              </w:p>
-            </w:tc>
-          </w:sdtContent>
-        </w:sdt>
-        <w:sdt>
-          <w:sdtPr>
-            <w:rPr>
-              <w:rFonts w:asciiTheme="minorHAnsi" w:hAnsiTheme="minorHAnsi" w:cstheme="minorHAnsi"/>
-              <w:color w:val="000000" w:themeColor="text1"/>
-              <w:sz w:val="22"/>
-              <w:szCs w:val="22"/>
-            </w:rPr>
-            <w:id w:val="880134221"/>
-            <w:picture/>
-          </w:sdtPr>
-          <w:sdtEndPr/>
-          <w:sdtContent>
-            <w:tc>
-              <w:tcPr>
-                <w:tcW w:w="2688" w:type="dxa"/>
-                <w:vAlign w:val="center"/>
-              </w:tcPr>
-              <w:p>
-                <w:pPr>
-                  <w:pStyle w:val="Default"/>
-                  <w:spacing w:line="360" w:lineRule="auto"/>
-                  <w:ind w:right="2034"/>
-                  <w:jc w:val="center"/>
-                  <w:rPr>
-                    <w:rFonts w:asciiTheme="minorHAnsi" w:hAnsiTheme="minorHAnsi" w:cstheme="minorHAnsi"/>
-                    <w:color w:val="000000" w:themeColor="text1"/>
-                    <w:sz w:val="22"/>
-                    <w:szCs w:val="22"/>
-                  </w:rPr>
-                </w:pPr>
-                <w:r>
-                  <w:rPr>
-                    <w:rFonts w:asciiTheme="minorHAnsi" w:hAnsiTheme="minorHAnsi" w:cstheme="minorHAnsi"/>
-                    <w:noProof/>
-                    <w:color w:val="000000" w:themeColor="text1"/>
-                    <w:sz w:val="22"/>
-                    <w:szCs w:val="22"/>
-                  </w:rPr>
-                  <w:drawing>
-                    <wp:inline distT="0" distB="0" distL="0" distR="0" wp14:anchorId="6DE3E6A7" wp14:editId="7B208E2D">
-                      <wp:extent cx="1800000" cy="1350000"/>
-                      <wp:effectExtent l="0" t="0" r="0" b="3175"/>
-                      <wp:docPr id="8" name="Imagen 5"/>
-                      <wp:cNvGraphicFramePr>
-                        <a:graphicFrameLocks xmlns:a="http://schemas.openxmlformats.org/drawingml/2006/main" noChangeAspect="1"/>
-                      </wp:cNvGraphicFramePr>
-                      <a:graphic xmlns:a="http://schemas.openxmlformats.org/drawingml/2006/main">
-                        <a:graphicData uri="http://schemas.openxmlformats.org/drawingml/2006/picture">
-                          <pic:pic xmlns:pic="http://schemas.openxmlformats.org/drawingml/2006/picture">
-                            <pic:nvPicPr>
-                              <pic:cNvPr id="8" name="Imagen 5"/>
-                              <pic:cNvPicPr>
-                                <a:picLocks noChangeAspect="1" noChangeArrowheads="1"/>
-                              </pic:cNvPicPr>
-                            </pic:nvPicPr>
-                            <pic:blipFill>
-                              <a:blip r:embed="rId8" cstate="print">
-                                <a:extLst>
-                                  <a:ext uri="{28A0092B-C50C-407E-A947-70E740481C1C}">
-                                    <a14:useLocalDpi xmlns:a14="http://schemas.microsoft.com/office/drawing/2010/main" val="0"/>
-                                  </a:ext>
-                                </a:extLst>
-                              </a:blip>
-                              <a:stretch>
-                                <a:fillRect/>
-                              </a:stretch>
-                            </pic:blipFill>
-                            <pic:spPr bwMode="auto">
-                              <a:xfrm>
-                                <a:off x="0" y="0"/>
-                                <a:ext cx="1800000" cy="1350000"/>
-                              </a:xfrm>
-                              <a:prstGeom prst="rect">
-                                <a:avLst/>
-                              </a:prstGeom>
-                              <a:noFill/>
-                              <a:ln>
-                                <a:noFill/>
-                              </a:ln>
-                            </pic:spPr>
-                          </pic:pic>
-                        </a:graphicData>
-                      </a:graphic>
-                    </wp:inline>
-                  </w:drawing>
-                </w:r>
-              </w:p>
-            </w:tc>
-          </w:sdtContent>
-        </w:sdt>
+        <w:tc>
+          <w:tcPr>
+            <w:tcW w:w="2977" w:type="dxa"/>
+            <w:vAlign w:val="center"/>
+          </w:tcPr>
+          <w:p>
+            <w:pPr>
+              <w:pStyle w:val="Default"/>
+              <w:spacing w:line="360" w:lineRule="auto"/>
+              <w:ind w:right="-110"/>
+              <w:jc w:val="center"/>
+              <w:rPr>
+                <w:rFonts w:asciiTheme="minorHAnsi" w:hAnsiTheme="minorHAnsi" w:cstheme="minorHAnsi"/>
+                <w:color w:val="000000" w:themeColor="text1"/>
+                <w:sz w:val="22"/>
+                <w:szCs w:val="22"/>
+              </w:rPr>
+            </w:pPr>
+            <w:r>
+              <w:rPr>
+                <w:rFonts w:asciiTheme="minorHAnsi" w:hAnsiTheme="minorHAnsi" w:cstheme="minorHAnsi"/>
+                <w:color w:val="000000" w:themeColor="text1"/>
+                <w:sz w:val="22"/>
+                <w:szCs w:val="22"/>
+              </w:rPr>
+              <w:t>{{ plan1 }}</w:t>
+            </w:r>
+          </w:p>
+        </w:tc>
+        <w:tc>
+          <w:tcPr>
+            <w:tcW w:w="2717" w:type="dxa"/>
+            <w:vAlign w:val="center"/>
+          </w:tcPr>
+          <w:p>
+            <w:pPr>
+              <w:pStyle w:val="Default"/>
+              <w:spacing w:line="360" w:lineRule="auto"/>
+              <w:ind w:right="-83"/>
+              <w:jc w:val="center"/>
+              <w:rPr>
+                <w:rFonts w:asciiTheme="minorHAnsi" w:hAnsiTheme="minorHAnsi" w:cstheme="minorHAnsi"/>
+                <w:color w:val="000000" w:themeColor="text1"/>
+                <w:sz w:val="22"/>
+                <w:szCs w:val="22"/>
+              </w:rPr>
+            </w:pPr>
+            <w:r>
+              <w:rPr>
+                <w:rFonts w:asciiTheme="minorHAnsi" w:hAnsiTheme="minorHAnsi" w:cstheme="minorHAnsi"/>
+                <w:color w:val="000000" w:themeColor="text1"/>
+                <w:sz w:val="22"/>
+                <w:szCs w:val="22"/>
+              </w:rPr>
+              <w:t>{{ plan</w:t>
+            </w:r>
+            <w:r>
+              <w:rPr>
+                <w:rFonts w:asciiTheme="minorHAnsi" w:hAnsiTheme="minorHAnsi" w:cstheme="minorHAnsi"/>
+                <w:color w:val="000000" w:themeColor="text1"/>
+                <w:sz w:val="22"/>
+                <w:szCs w:val="22"/>
+              </w:rPr>
+              <w:t>2</w:t>
+            </w:r>
+            <w:r>
+              <w:rPr>
+                <w:rFonts w:asciiTheme="minorHAnsi" w:hAnsiTheme="minorHAnsi" w:cstheme="minorHAnsi"/>
+                <w:color w:val="000000" w:themeColor="text1"/>
+                <w:sz w:val="22"/>
+                <w:szCs w:val="22"/>
+              </w:rPr>
+              <w:t xml:space="preserve"> }}</w:t>
+            </w:r>
+          </w:p>
+        </w:tc>
+        <w:tc>
+          <w:tcPr>
+            <w:tcW w:w="3139" w:type="dxa"/>
+            <w:gridSpan w:val="2"/>
+            <w:vAlign w:val="center"/>
+          </w:tcPr>
+          <w:p>
+            <w:pPr>
+              <w:pStyle w:val="Default"/>
+              <w:spacing w:line="360" w:lineRule="auto"/>
+              <w:ind w:right="-69"/>
+              <w:jc w:val="center"/>
+              <w:rPr>
+                <w:rFonts w:asciiTheme="minorHAnsi" w:hAnsiTheme="minorHAnsi" w:cstheme="minorHAnsi"/>
+                <w:color w:val="000000" w:themeColor="text1"/>
+                <w:sz w:val="22"/>
+                <w:szCs w:val="22"/>
+              </w:rPr>
+            </w:pPr>
+            <w:r>
+              <w:rPr>
+                <w:rFonts w:asciiTheme="minorHAnsi" w:hAnsiTheme="minorHAnsi" w:cstheme="minorHAnsi"/>
+                <w:color w:val="000000" w:themeColor="text1"/>
+                <w:sz w:val="22"/>
+                <w:szCs w:val="22"/>
+              </w:rPr>
+              <w:t>{{ plan</w:t>
+            </w:r>
+            <w:r>
+              <w:rPr>
+                <w:rFonts w:asciiTheme="minorHAnsi" w:hAnsiTheme="minorHAnsi" w:cstheme="minorHAnsi"/>
+                <w:color w:val="000000" w:themeColor="text1"/>
+                <w:sz w:val="22"/>
+                <w:szCs w:val="22"/>
+              </w:rPr>
+              <w:t>3</w:t>
+            </w:r>
+            <w:r>
+              <w:rPr>
+                <w:rFonts w:asciiTheme="minorHAnsi" w:hAnsiTheme="minorHAnsi" w:cstheme="minorHAnsi"/>
+                <w:color w:val="000000" w:themeColor="text1"/>
+                <w:sz w:val="22"/>
+                <w:szCs w:val="22"/>
+              </w:rPr>
+              <w:t xml:space="preserve"> }}</w:t>
+            </w:r>
+          </w:p>
+        </w:tc>
       </w:tr>
       <w:tr>
         <w:trPr>
@@ -1210,7 +1141,7 @@
         <w:tc>
           <w:tcPr>
             <w:tcW w:w="6145" w:type="dxa"/>
-            <w:gridSpan w:val="2"/>
+            <w:gridSpan w:val="3"/>
             <w:vAlign w:val="center"/>
           </w:tcPr>
           <w:p>
@@ -1267,12 +1198,54 @@
       </w:tr>
       <w:tr>
         <w:trPr>
+          <w:trHeight w:val="227"/>
+        </w:trPr>
+        <w:tc>
+          <w:tcPr>
+            <w:tcW w:w="6145" w:type="dxa"/>
+            <w:gridSpan w:val="3"/>
+            <w:vAlign w:val="center"/>
+          </w:tcPr>
+          <w:p>
+            <w:pPr>
+              <w:pStyle w:val="Default"/>
+              <w:ind w:right="-60"/>
+              <w:rPr>
+                <w:rFonts w:asciiTheme="minorHAnsi" w:hAnsiTheme="minorHAnsi" w:cstheme="minorHAnsi"/>
+                <w:color w:val="000000" w:themeColor="text1"/>
+                <w:sz w:val="20"/>
+                <w:szCs w:val="20"/>
+              </w:rPr>
+            </w:pPr>
+          </w:p>
+        </w:tc>
+        <w:tc>
+          <w:tcPr>
+            <w:tcW w:w="2688" w:type="dxa"/>
+            <w:vAlign w:val="center"/>
+          </w:tcPr>
+          <w:p>
+            <w:pPr>
+              <w:pStyle w:val="Default"/>
+              <w:jc w:val="center"/>
+              <w:rPr>
+                <w:rFonts w:asciiTheme="minorHAnsi" w:hAnsiTheme="minorHAnsi" w:cstheme="minorHAnsi"/>
+                <w:color w:val="000000" w:themeColor="text1"/>
+                <w:sz w:val="20"/>
+                <w:szCs w:val="20"/>
+              </w:rPr>
+            </w:pPr>
+          </w:p>
+        </w:tc>
+      </w:tr>
+      <w:tr>
+        <w:trPr>
           <w:trHeight w:val="2952"/>
         </w:trPr>
         <w:tc>
           <w:tcPr>
             <w:tcW w:w="6145" w:type="dxa"/>
-            <w:gridSpan w:val="2"/>
+            <w:gridSpan w:val="3"/>
             <w:vAlign w:val="center"/>
           </w:tcPr>
           <w:p>
@@ -1416,6 +1389,7 @@
               <w:pStyle w:val="Prrafodelista"/>
               <w:spacing w:line="360" w:lineRule="auto"/>
               <w:ind w:left="0"/>
+              <w:jc w:val="both"/>
               <w:rPr>
                 <w:rFonts w:cstheme="minorHAnsi"/>
                 <w:color w:val="000000" w:themeColor="text1"/>
@@ -1516,7 +1490,7 @@
           <w:p>
             <w:pPr>
               <w:pStyle w:val="Prrafodelista"/>
-              <w:spacing w:line="360" w:lineRule="auto"/>
+              <w:spacing w:after="0" w:line="360" w:lineRule="auto"/>
               <w:ind w:left="0"/>
               <w:jc w:val="center"/>
               <w:rPr>
@@ -1535,6 +1509,9 @@
         </w:tc>
       </w:tr>
       <w:tr>
+        <w:trPr>
+          <w:trHeight w:val="20"/>
+        </w:trPr>
         <w:tc>
           <w:tcPr>
             <w:tcW w:w="4414" w:type="dxa"/>
@@ -1543,34 +1520,18 @@
           <w:p>
             <w:pPr>
               <w:pStyle w:val="Prrafodelista"/>
-              <w:spacing w:line="360" w:lineRule="auto"/>
+              <w:spacing w:line="240" w:lineRule="auto"/>
               <w:ind w:left="0"/>
+              <w:jc w:val="both"/>
               <w:rPr>
                 <w:rFonts w:cstheme="minorHAnsi"/>
+                <w:noProof/>
                 <w:color w:val="000000" w:themeColor="text1"/>
+                <w:sz w:val="20"/>
+                <w:szCs w:val="20"/>
+                <w:lang w:eastAsia="es-MX"/>
               </w:rPr>
             </w:pPr>
-            <w:r>
-              <w:t xml:space="preserve">Cuenta con </w:t>
-            </w:r>
-            <w:r>
-              <w:t>lámparas de emergencia</w:t>
-            </w:r>
-            <w:r>
-              <w:t xml:space="preserve"> de acuerdo con norma y área de riesgo se encuentran vigentes, se </w:t>
-            </w:r>
-            <w:r>
-              <w:t>recomienda</w:t>
-            </w:r>
-            <w:r>
-              <w:t xml:space="preserve"> </w:t>
-            </w:r>
-            <w:r>
-              <w:t>dar seguimiento al</w:t>
-            </w:r>
-            <w:r>
-              <w:t xml:space="preserve"> programa de mantenimiento anual.</w:t>
-            </w:r>
           </w:p>
         </w:tc>
         <w:tc>
@@ -1581,21 +1542,16 @@
           <w:p>
             <w:pPr>
               <w:pStyle w:val="Prrafodelista"/>
-              <w:spacing w:line="360" w:lineRule="auto"/>
+              <w:spacing w:after="0" w:line="240" w:lineRule="auto"/>
               <w:ind w:left="0"/>
               <w:jc w:val="center"/>
               <w:rPr>
                 <w:rFonts w:cstheme="minorHAnsi"/>
                 <w:color w:val="000000" w:themeColor="text1"/>
+                <w:sz w:val="20"/>
+                <w:szCs w:val="20"/>
               </w:rPr>
             </w:pPr>
-            <w:r>
-              <w:rPr>
-                <w:rFonts w:cstheme="minorHAnsi"/>
-                <w:color w:val="000000" w:themeColor="text1"/>
-              </w:rPr>
-              <w:t>{{ puerta }}</w:t>
-            </w:r>
           </w:p>
         </w:tc>
       </w:tr>
@@ -1610,6 +1566,113 @@
               <w:pStyle w:val="Prrafodelista"/>
               <w:spacing w:line="360" w:lineRule="auto"/>
               <w:ind w:left="0"/>
+              <w:jc w:val="both"/>
+              <w:rPr>
+                <w:rFonts w:cstheme="minorHAnsi"/>
+                <w:color w:val="000000" w:themeColor="text1"/>
+              </w:rPr>
+            </w:pPr>
+            <w:r>
+              <w:rPr>
+                <w:rFonts w:cstheme="minorHAnsi"/>
+                <w:color w:val="000000" w:themeColor="text1"/>
+              </w:rPr>
+              <w:t xml:space="preserve">El botiquín cuenta con material de curación (NO DEBE CONTENER MEDICAMENTO DE ACUERDO </w:t>
+            </w:r>
+            <w:r>
+              <w:rPr>
+                <w:rFonts w:cstheme="minorHAnsi"/>
+                <w:color w:val="000000" w:themeColor="text1"/>
+              </w:rPr>
+              <w:t>CON</w:t>
+            </w:r>
+            <w:r>
+              <w:rPr>
+                <w:rFonts w:cstheme="minorHAnsi"/>
+                <w:color w:val="000000" w:themeColor="text1"/>
+              </w:rPr>
+              <w:t xml:space="preserve"> LA NOM-030-STPS-2009 Y NOM-020-STPS-1994) debe contar con bitácora de mantenimiento a cargo de la brigada de Primeros auxilios indicación actual.</w:t>
+            </w:r>
+          </w:p>
+        </w:tc>
+        <w:tc>
+          <w:tcPr>
+            <w:tcW w:w="4414" w:type="dxa"/>
+            <w:vAlign w:val="center"/>
+          </w:tcPr>
+          <w:p>
+            <w:pPr>
+              <w:pStyle w:val="Prrafodelista"/>
+              <w:spacing w:after="0" w:line="360" w:lineRule="auto"/>
+              <w:ind w:left="0"/>
+              <w:jc w:val="center"/>
+              <w:rPr>
+                <w:rFonts w:cstheme="minorHAnsi"/>
+                <w:color w:val="000000" w:themeColor="text1"/>
+              </w:rPr>
+            </w:pPr>
+            <w:r>
+              <w:rPr>
+                <w:rFonts w:cstheme="minorHAnsi"/>
+                <w:color w:val="000000" w:themeColor="text1"/>
+              </w:rPr>
+              <w:t>{{ botiquin }}</w:t>
+            </w:r>
+          </w:p>
+        </w:tc>
+      </w:tr>
+      <w:tr>
+        <w:tc>
+          <w:tcPr>
+            <w:tcW w:w="4414" w:type="dxa"/>
+            <w:vAlign w:val="center"/>
+          </w:tcPr>
+          <w:p>
+            <w:pPr>
+              <w:pStyle w:val="Prrafodelista"/>
+              <w:spacing w:line="240" w:lineRule="auto"/>
+              <w:ind w:left="0"/>
+              <w:jc w:val="both"/>
+              <w:rPr>
+                <w:sz w:val="20"/>
+                <w:szCs w:val="20"/>
+              </w:rPr>
+            </w:pPr>
+          </w:p>
+        </w:tc>
+        <w:tc>
+          <w:tcPr>
+            <w:tcW w:w="4414" w:type="dxa"/>
+            <w:vAlign w:val="center"/>
+          </w:tcPr>
+          <w:p>
+            <w:pPr>
+              <w:pStyle w:val="Prrafodelista"/>
+              <w:spacing w:after="0" w:line="240" w:lineRule="auto"/>
+              <w:ind w:left="0"/>
+              <w:jc w:val="center"/>
+              <w:rPr>
+                <w:rFonts w:cstheme="minorHAnsi"/>
+                <w:color w:val="000000" w:themeColor="text1"/>
+                <w:sz w:val="20"/>
+                <w:szCs w:val="20"/>
+              </w:rPr>
+            </w:pPr>
+          </w:p>
+        </w:tc>
+      </w:tr>
+      <w:tr>
+        <w:tc>
+          <w:tcPr>
+            <w:tcW w:w="4414" w:type="dxa"/>
+            <w:vAlign w:val="center"/>
+          </w:tcPr>
+          <w:p>
+            <w:pPr>
+              <w:pStyle w:val="Prrafodelista"/>
+              <w:spacing w:line="360" w:lineRule="auto"/>
+              <w:ind w:left="0"/>
+              <w:jc w:val="both"/>
               <w:rPr>
                 <w:rFonts w:cstheme="minorHAnsi"/>
                 <w:color w:val="000000" w:themeColor="text1"/>
@@ -1651,7 +1714,7 @@
           <w:p>
             <w:pPr>
               <w:pStyle w:val="Prrafodelista"/>
-              <w:spacing w:line="360" w:lineRule="auto"/>
+              <w:spacing w:after="0" w:line="360" w:lineRule="auto"/>
               <w:ind w:left="0"/>
               <w:jc w:val="center"/>
               <w:rPr>
@@ -1739,73 +1802,9 @@
           <w:p>
             <w:pPr>
               <w:pStyle w:val="Prrafodelista"/>
-              <w:spacing w:line="360" w:lineRule="auto"/>
+              <w:spacing w:after="0" w:line="360" w:lineRule="auto"/>
               <w:ind w:left="0"/>
-              <w:rPr>
-                <w:rFonts w:cstheme="minorHAnsi"/>
-                <w:color w:val="000000" w:themeColor="text1"/>
-              </w:rPr>
-            </w:pPr>
-            <w:r>
-              <w:rPr>
-                <w:rFonts w:cstheme="minorHAnsi"/>
-                <w:color w:val="000000" w:themeColor="text1"/>
-              </w:rPr>
-              <w:t xml:space="preserve">El botiquín cuenta con material de curación (NO DEBE CONTENER MEDICAMENTO DE ACUERDO </w:t>
-            </w:r>
-            <w:r>
-              <w:rPr>
-                <w:rFonts w:cstheme="minorHAnsi"/>
-                <w:color w:val="000000" w:themeColor="text1"/>
-              </w:rPr>
-              <w:t>CON</w:t>
-            </w:r>
-            <w:r>
-              <w:rPr>
-                <w:rFonts w:cstheme="minorHAnsi"/>
-                <w:color w:val="000000" w:themeColor="text1"/>
-              </w:rPr>
-              <w:t xml:space="preserve"> LA NOM-030-STPS-2009 Y NOM-020-STPS-1994) debe contar con bitácora de mantenimiento a cargo de la brigada de Primeros auxilios indicación actual.</w:t>
-            </w:r>
-          </w:p>
-        </w:tc>
-        <w:tc>
-          <w:tcPr>
-            <w:tcW w:w="4414" w:type="dxa"/>
-            <w:vAlign w:val="center"/>
-          </w:tcPr>
-          <w:p>
-            <w:pPr>
-              <w:pStyle w:val="Prrafodelista"/>
-              <w:spacing w:line="360" w:lineRule="auto"/>
-              <w:ind w:left="0"/>
-              <w:jc w:val="center"/>
-              <w:rPr>
-                <w:rFonts w:cstheme="minorHAnsi"/>
-                <w:color w:val="000000" w:themeColor="text1"/>
-              </w:rPr>
-            </w:pPr>
-            <w:r>
-              <w:rPr>
-                <w:rFonts w:cstheme="minorHAnsi"/>
-                <w:color w:val="000000" w:themeColor="text1"/>
-              </w:rPr>
-              <w:t>{{ botiquin }}</w:t>
-            </w:r>
-          </w:p>
-        </w:tc>
-      </w:tr>
-      <w:tr>
-        <w:tc>
-          <w:tcPr>
-            <w:tcW w:w="4414" w:type="dxa"/>
-            <w:vAlign w:val="center"/>
-          </w:tcPr>
-          <w:p>
-            <w:pPr>
-              <w:pStyle w:val="Prrafodelista"/>
-              <w:spacing w:line="360" w:lineRule="auto"/>
-              <w:ind w:left="0"/>
+              <w:jc w:val="both"/>
               <w:rPr>
                 <w:rFonts w:cstheme="minorHAnsi"/>
                 <w:color w:val="000000" w:themeColor="text1"/>
@@ -1824,7 +1823,7 @@
           <w:p>
             <w:pPr>
               <w:pStyle w:val="Prrafodelista"/>
-              <w:spacing w:line="360" w:lineRule="auto"/>
+              <w:spacing w:after="0" w:line="360" w:lineRule="auto"/>
               <w:ind w:left="0"/>
               <w:jc w:val="center"/>
               <w:rPr>
@@ -1839,6 +1838,9 @@
         </w:tc>
       </w:tr>
       <w:tr>
+        <w:trPr>
+          <w:trHeight w:val="20"/>
+        </w:trPr>
         <w:tc>
           <w:tcPr>
             <w:tcW w:w="4414" w:type="dxa"/>
@@ -1847,39 +1849,14 @@
           <w:p>
             <w:pPr>
               <w:pStyle w:val="Prrafodelista"/>
-              <w:spacing w:line="360" w:lineRule="auto"/>
+              <w:spacing w:after="0" w:line="240" w:lineRule="auto"/>
               <w:ind w:left="0"/>
-            </w:pPr>
-            <w:r>
-              <w:t xml:space="preserve">Cuenta con detectores de humo fotoeléctrico de acuerdo con norma y área de riesgo se encuentran vigentes, se </w:t>
-            </w:r>
-            <w:r>
-              <w:t>recomienda</w:t>
-            </w:r>
-            <w:r>
-              <w:t xml:space="preserve"> </w:t>
-            </w:r>
-            <w:r>
-              <w:t>dar seguimiento al</w:t>
-            </w:r>
-            <w:r>
-              <w:t xml:space="preserve"> programa de mantenimiento</w:t>
-            </w:r>
-            <w:r>
-              <w:t xml:space="preserve"> anual</w:t>
-            </w:r>
-            <w:r>
-              <w:t>.</w:t>
-            </w:r>
-          </w:p>
-          <w:p>
-            <w:pPr>
-              <w:pStyle w:val="Prrafodelista"/>
-              <w:spacing w:line="360" w:lineRule="auto"/>
-              <w:ind w:left="0"/>
+              <w:jc w:val="both"/>
               <w:rPr>
                 <w:rFonts w:cstheme="minorHAnsi"/>
                 <w:color w:val="000000" w:themeColor="text1"/>
+                <w:sz w:val="20"/>
+                <w:szCs w:val="20"/>
               </w:rPr>
             </w:pPr>
           </w:p>
@@ -1892,7 +1869,48 @@
           <w:p>
             <w:pPr>
               <w:pStyle w:val="Prrafodelista"/>
-              <w:spacing w:line="360" w:lineRule="auto"/>
+              <w:spacing w:after="0" w:line="240" w:lineRule="auto"/>
+              <w:ind w:left="0"/>
+              <w:jc w:val="center"/>
+              <w:rPr>
+                <w:rFonts w:cstheme="minorHAnsi"/>
+                <w:color w:val="000000" w:themeColor="text1"/>
+              </w:rPr>
+            </w:pPr>
+          </w:p>
+        </w:tc>
+      </w:tr>
+      <w:tr>
+        <w:tc>
+          <w:tcPr>
+            <w:tcW w:w="4414" w:type="dxa"/>
+            <w:vAlign w:val="center"/>
+          </w:tcPr>
+          <w:p>
+            <w:pPr>
+              <w:pStyle w:val="Prrafodelista"/>
+              <w:spacing w:after="0" w:line="360" w:lineRule="auto"/>
+              <w:ind w:left="0"/>
+              <w:jc w:val="both"/>
+              <w:rPr>
+                <w:rFonts w:cstheme="minorHAnsi"/>
+                <w:color w:val="000000" w:themeColor="text1"/>
+              </w:rPr>
+            </w:pPr>
+            <w:r>
+              <w:t>Cuenta con detectores de humo fotoeléctrico de acuerdo con norma y área de riesgo se encuentran vigentes, se recomienda dar seguimiento al programa de mantenimiento anual.</w:t>
+            </w:r>
+          </w:p>
+        </w:tc>
+        <w:tc>
+          <w:tcPr>
+            <w:tcW w:w="4414" w:type="dxa"/>
+            <w:vAlign w:val="center"/>
+          </w:tcPr>
+          <w:p>
+            <w:pPr>
+              <w:pStyle w:val="Prrafodelista"/>
+              <w:spacing w:after="0" w:line="360" w:lineRule="auto"/>
               <w:ind w:left="0"/>
               <w:jc w:val="center"/>
               <w:rPr>
@@ -1906,39 +1924,132 @@
           </w:p>
         </w:tc>
       </w:tr>
+      <w:tr>
+        <w:tc>
+          <w:tcPr>
+            <w:tcW w:w="4414" w:type="dxa"/>
+            <w:vAlign w:val="center"/>
+          </w:tcPr>
+          <w:p>
+            <w:pPr>
+              <w:pStyle w:val="Prrafodelista"/>
+              <w:spacing w:after="0" w:line="240" w:lineRule="auto"/>
+              <w:ind w:left="0"/>
+              <w:jc w:val="both"/>
+              <w:rPr>
+                <w:sz w:val="20"/>
+                <w:szCs w:val="20"/>
+              </w:rPr>
+            </w:pPr>
+          </w:p>
+        </w:tc>
+        <w:tc>
+          <w:tcPr>
+            <w:tcW w:w="4414" w:type="dxa"/>
+            <w:vAlign w:val="center"/>
+          </w:tcPr>
+          <w:p>
+            <w:pPr>
+              <w:pStyle w:val="Prrafodelista"/>
+              <w:spacing w:after="0" w:line="240" w:lineRule="auto"/>
+              <w:ind w:left="0"/>
+              <w:jc w:val="center"/>
+              <w:rPr>
+                <w:sz w:val="20"/>
+                <w:szCs w:val="20"/>
+              </w:rPr>
+            </w:pPr>
+          </w:p>
+        </w:tc>
+      </w:tr>
+      <w:tr>
+        <w:tc>
+          <w:tcPr>
+            <w:tcW w:w="4414" w:type="dxa"/>
+            <w:vAlign w:val="center"/>
+          </w:tcPr>
+          <w:p>
+            <w:pPr>
+              <w:pStyle w:val="Prrafodelista"/>
+              <w:spacing w:after="0" w:line="360" w:lineRule="auto"/>
+              <w:ind w:left="0"/>
+              <w:jc w:val="both"/>
+            </w:pPr>
+            <w:r>
+              <w:t xml:space="preserve">Cuenta con </w:t>
+            </w:r>
+            <w:r>
+              <w:t>lámparas de emergencia</w:t>
+            </w:r>
+            <w:r>
+              <w:t xml:space="preserve"> de acuerdo con norma y área de riesgo se encuentran vigentes, se </w:t>
+            </w:r>
+            <w:r>
+              <w:t>recomienda</w:t>
+            </w:r>
+            <w:r>
+              <w:t xml:space="preserve"> </w:t>
+            </w:r>
+            <w:r>
+              <w:t>dar seguimiento al</w:t>
+            </w:r>
+            <w:r>
+              <w:t xml:space="preserve"> programa de mantenimiento anual.</w:t>
+            </w:r>
+          </w:p>
+        </w:tc>
+        <w:tc>
+          <w:tcPr>
+            <w:tcW w:w="4414" w:type="dxa"/>
+            <w:vAlign w:val="center"/>
+          </w:tcPr>
+          <w:p>
+            <w:pPr>
+              <w:pStyle w:val="Prrafodelista"/>
+              <w:spacing w:after="0" w:line="360" w:lineRule="auto"/>
+              <w:ind w:left="0"/>
+              <w:jc w:val="center"/>
+              <w:rPr>
+                <w:rFonts w:cstheme="minorHAnsi"/>
+                <w:color w:val="000000" w:themeColor="text1"/>
+              </w:rPr>
+            </w:pPr>
+            <w:r>
+              <w:rPr>
+                <w:rFonts w:cstheme="minorHAnsi"/>
+                <w:color w:val="000000" w:themeColor="text1"/>
+              </w:rPr>
+              <w:t xml:space="preserve">{{ </w:t>
+            </w:r>
+            <w:r>
+              <w:rPr>
+                <w:rFonts w:cstheme="minorHAnsi"/>
+                <w:color w:val="000000" w:themeColor="text1"/>
+              </w:rPr>
+              <w:t>lampara</w:t>
+            </w:r>
+            <w:r>
+              <w:rPr>
+                <w:rFonts w:cstheme="minorHAnsi"/>
+                <w:color w:val="000000" w:themeColor="text1"/>
+              </w:rPr>
+              <w:t xml:space="preserve"> }}</w:t>
+            </w:r>
+          </w:p>
+        </w:tc>
+      </w:tr>
     </w:tbl>
-    <w:p>
-      <w:pPr>
-        <w:pStyle w:val="Prrafodelista"/>
-        <w:spacing w:after="0" w:line="360" w:lineRule="auto"/>
-        <w:jc w:val="both"/>
-        <w:rPr>
-          <w:rFonts w:cstheme="minorHAnsi"/>
-          <w:color w:val="000000" w:themeColor="text1"/>
-        </w:rPr>
-      </w:pPr>
-    </w:p>
-    <w:p>
-      <w:pPr>
-        <w:spacing w:after="0" w:line="360" w:lineRule="auto"/>
-        <w:jc w:val="both"/>
-        <w:rPr>
-          <w:rFonts w:cstheme="minorHAnsi"/>
-          <w:color w:val="000000" w:themeColor="text1"/>
-        </w:rPr>
-      </w:pPr>
-    </w:p>
     <w:p/>
     <w:p/>
     <w:p>
       <w:pPr>
         <w:sectPr>
-          <w:headerReference w:type="even" r:id="rId9"/>
-          <w:headerReference w:type="default" r:id="rId10"/>
-          <w:footerReference w:type="even" r:id="rId11"/>
-          <w:footerReference w:type="default" r:id="rId12"/>
-          <w:headerReference w:type="first" r:id="rId13"/>
-          <w:footerReference w:type="first" r:id="rId14"/>
+          <w:headerReference w:type="even" r:id="rId7"/>
+          <w:headerReference w:type="default" r:id="rId8"/>
+          <w:footerReference w:type="even" r:id="rId9"/>
+          <w:footerReference w:type="default" r:id="rId10"/>
+          <w:headerReference w:type="first" r:id="rId11"/>
+          <w:footerReference w:type="first" r:id="rId12"/>
           <w:pgSz w:w="12240" w:h="15840" w:code="1"/>
           <w:pgMar w:top="1417" w:right="1701" w:bottom="1417" w:left="1701" w:header="426" w:footer="535" w:gutter="0"/>
           <w:cols w:space="708"/>
@@ -1952,8 +2063,8 @@
       </w:pPr>
     </w:p>
     <w:sectPr>
-      <w:headerReference w:type="default" r:id="rId15"/>
-      <w:footerReference w:type="default" r:id="rId16"/>
+      <w:headerReference w:type="default" r:id="rId13"/>
+      <w:footerReference w:type="default" r:id="rId14"/>
       <w:type w:val="continuous"/>
       <w:pgSz w:w="12240" w:h="15840" w:code="1"/>
       <w:pgMar w:top="1417" w:right="1701" w:bottom="1417" w:left="1701" w:header="426" w:footer="920" w:gutter="0"/>

</xml_diff>

<commit_message>
Actualizacion fotos y plantillas general MF general
</commit_message>
<xml_diff>
--- a/Inputs/Templates/MF General.docx
+++ b/Inputs/Templates/MF General.docx
@@ -397,7 +397,7 @@
           <w:rFonts w:cstheme="minorHAnsi"/>
           <w:color w:val="000000" w:themeColor="text1"/>
         </w:rPr>
-        <w:t xml:space="preserve"> Cuenta con </w:t>
+        <w:t xml:space="preserve">Cuenta con </w:t>
       </w:r>
       <w:proofErr w:type="gramStart"/>
       <w:r>
@@ -478,7 +478,7 @@
           <w:sz w:val="22"/>
           <w:szCs w:val="22"/>
         </w:rPr>
-        <w:t xml:space="preserve"> Con el objetivo de controlar el cumplimiento en materia de Protección civil y las normas de higiene y seguridad en el trabajo, puede establecerse que:</w:t>
+        <w:t>Con el objetivo de controlar el cumplimiento en materia de Protección civil y las normas de higiene y seguridad en el trabajo, puede establecerse que:</w:t>
       </w:r>
     </w:p>
     <w:p>
@@ -554,7 +554,7 @@
       </w:tr>
       <w:tr>
         <w:trPr>
-          <w:trHeight w:val="3888"/>
+          <w:trHeight w:val="3628"/>
         </w:trPr>
         <w:tc>
           <w:tcPr>
@@ -640,6 +640,202 @@
                 <w:szCs w:val="22"/>
               </w:rPr>
               <w:t xml:space="preserve"> }}</w:t>
+            </w:r>
+          </w:p>
+        </w:tc>
+      </w:tr>
+      <w:tr>
+        <w:trPr>
+          <w:trHeight w:val="3628"/>
+        </w:trPr>
+        <w:tc>
+          <w:tcPr>
+            <w:tcW w:w="4416" w:type="dxa"/>
+            <w:vAlign w:val="center"/>
+          </w:tcPr>
+          <w:p>
+            <w:pPr>
+              <w:pStyle w:val="Default"/>
+              <w:spacing w:line="360" w:lineRule="auto"/>
+              <w:jc w:val="center"/>
+              <w:rPr>
+                <w:rFonts w:asciiTheme="minorHAnsi" w:hAnsiTheme="minorHAnsi" w:cstheme="minorHAnsi"/>
+                <w:color w:val="000000" w:themeColor="text1"/>
+                <w:sz w:val="22"/>
+                <w:szCs w:val="22"/>
+              </w:rPr>
+            </w:pPr>
+            <w:proofErr w:type="gramStart"/>
+            <w:r>
+              <w:rPr>
+                <w:rFonts w:asciiTheme="minorHAnsi" w:hAnsiTheme="minorHAnsi" w:cstheme="minorHAnsi"/>
+                <w:color w:val="000000" w:themeColor="text1"/>
+                <w:sz w:val="22"/>
+                <w:szCs w:val="22"/>
+              </w:rPr>
+              <w:t>{{ ext</w:t>
+            </w:r>
+            <w:proofErr w:type="gramEnd"/>
+            <w:r>
+              <w:rPr>
+                <w:rFonts w:asciiTheme="minorHAnsi" w:hAnsiTheme="minorHAnsi" w:cstheme="minorHAnsi"/>
+                <w:color w:val="000000" w:themeColor="text1"/>
+                <w:sz w:val="22"/>
+                <w:szCs w:val="22"/>
+              </w:rPr>
+              <w:t>3</w:t>
+            </w:r>
+            <w:r>
+              <w:rPr>
+                <w:rFonts w:asciiTheme="minorHAnsi" w:hAnsiTheme="minorHAnsi" w:cstheme="minorHAnsi"/>
+                <w:color w:val="000000" w:themeColor="text1"/>
+                <w:sz w:val="22"/>
+                <w:szCs w:val="22"/>
+              </w:rPr>
+              <w:t xml:space="preserve"> }}</w:t>
+            </w:r>
+          </w:p>
+        </w:tc>
+        <w:tc>
+          <w:tcPr>
+            <w:tcW w:w="4417" w:type="dxa"/>
+            <w:vAlign w:val="center"/>
+          </w:tcPr>
+          <w:p>
+            <w:pPr>
+              <w:pStyle w:val="Default"/>
+              <w:spacing w:line="360" w:lineRule="auto"/>
+              <w:jc w:val="center"/>
+              <w:rPr>
+                <w:rFonts w:asciiTheme="minorHAnsi" w:hAnsiTheme="minorHAnsi" w:cstheme="minorHAnsi"/>
+                <w:color w:val="000000" w:themeColor="text1"/>
+                <w:sz w:val="22"/>
+                <w:szCs w:val="22"/>
+              </w:rPr>
+            </w:pPr>
+            <w:proofErr w:type="gramStart"/>
+            <w:r>
+              <w:rPr>
+                <w:rFonts w:asciiTheme="minorHAnsi" w:hAnsiTheme="minorHAnsi" w:cstheme="minorHAnsi"/>
+                <w:color w:val="000000" w:themeColor="text1"/>
+                <w:sz w:val="22"/>
+                <w:szCs w:val="22"/>
+              </w:rPr>
+              <w:t>{{ ext</w:t>
+            </w:r>
+            <w:proofErr w:type="gramEnd"/>
+            <w:r>
+              <w:rPr>
+                <w:rFonts w:asciiTheme="minorHAnsi" w:hAnsiTheme="minorHAnsi" w:cstheme="minorHAnsi"/>
+                <w:color w:val="000000" w:themeColor="text1"/>
+                <w:sz w:val="22"/>
+                <w:szCs w:val="22"/>
+              </w:rPr>
+              <w:t>4</w:t>
+            </w:r>
+            <w:r>
+              <w:rPr>
+                <w:rFonts w:asciiTheme="minorHAnsi" w:hAnsiTheme="minorHAnsi" w:cstheme="minorHAnsi"/>
+                <w:color w:val="000000" w:themeColor="text1"/>
+                <w:sz w:val="22"/>
+                <w:szCs w:val="22"/>
+              </w:rPr>
+              <w:t xml:space="preserve"> }}</w:t>
+            </w:r>
+          </w:p>
+        </w:tc>
+      </w:tr>
+    </w:tbl>
+    <w:p>
+      <w:pPr>
+        <w:rPr>
+          <w:rFonts w:cstheme="minorHAnsi"/>
+          <w:color w:val="000000" w:themeColor="text1"/>
+        </w:rPr>
+      </w:pPr>
+      <w:r>
+        <w:rPr>
+          <w:rFonts w:cstheme="minorHAnsi"/>
+          <w:color w:val="000000" w:themeColor="text1"/>
+        </w:rPr>
+        <w:br w:type="page"/>
+      </w:r>
+    </w:p>
+    <w:p>
+      <w:pPr>
+        <w:rPr>
+          <w:rFonts w:cstheme="minorHAnsi"/>
+          <w:color w:val="000000" w:themeColor="text1"/>
+        </w:rPr>
+      </w:pPr>
+    </w:p>
+    <w:tbl>
+      <w:tblPr>
+        <w:tblStyle w:val="Tablaconcuadrcula"/>
+        <w:tblW w:w="0" w:type="auto"/>
+        <w:tblInd w:w="-5" w:type="dxa"/>
+        <w:tblBorders>
+          <w:top w:val="none" w:sz="0" w:space="0" w:color="auto"/>
+          <w:left w:val="none" w:sz="0" w:space="0" w:color="auto"/>
+          <w:bottom w:val="none" w:sz="0" w:space="0" w:color="auto"/>
+          <w:right w:val="none" w:sz="0" w:space="0" w:color="auto"/>
+          <w:insideH w:val="none" w:sz="0" w:space="0" w:color="auto"/>
+          <w:insideV w:val="none" w:sz="0" w:space="0" w:color="auto"/>
+        </w:tblBorders>
+        <w:tblLook w:val="04A0" w:firstRow="1" w:lastRow="0" w:firstColumn="1" w:lastColumn="0" w:noHBand="0" w:noVBand="1"/>
+      </w:tblPr>
+      <w:tblGrid>
+        <w:gridCol w:w="4416"/>
+        <w:gridCol w:w="4417"/>
+      </w:tblGrid>
+      <w:tr>
+        <w:trPr>
+          <w:trHeight w:val="1701"/>
+        </w:trPr>
+        <w:tc>
+          <w:tcPr>
+            <w:tcW w:w="8833" w:type="dxa"/>
+            <w:gridSpan w:val="2"/>
+            <w:vAlign w:val="center"/>
+          </w:tcPr>
+          <w:p>
+            <w:pPr>
+              <w:pStyle w:val="Default"/>
+              <w:spacing w:line="360" w:lineRule="auto"/>
+              <w:jc w:val="both"/>
+              <w:rPr>
+                <w:rFonts w:asciiTheme="minorHAnsi" w:hAnsiTheme="minorHAnsi" w:cstheme="minorHAnsi"/>
+                <w:color w:val="000000" w:themeColor="text1"/>
+                <w:sz w:val="22"/>
+                <w:szCs w:val="22"/>
+              </w:rPr>
+            </w:pPr>
+            <w:r>
+              <w:rPr>
+                <w:rFonts w:asciiTheme="minorHAnsi" w:hAnsiTheme="minorHAnsi" w:cstheme="minorHAnsi"/>
+                <w:color w:val="000000" w:themeColor="text1"/>
+                <w:sz w:val="22"/>
+                <w:szCs w:val="22"/>
+              </w:rPr>
+              <w:t>Las vías de evacuación, tanto verticales y horizontales se encuentran calculadas para una correcta evacuación d</w:t>
+            </w:r>
+            <w:r>
+              <w:rPr>
+                <w:rFonts w:asciiTheme="minorHAnsi" w:hAnsiTheme="minorHAnsi" w:cstheme="minorHAnsi"/>
+                <w:color w:val="000000" w:themeColor="text1"/>
+                <w:sz w:val="22"/>
+                <w:szCs w:val="22"/>
+              </w:rPr>
+              <w:t>el inmueble</w:t>
+            </w:r>
+            <w:r>
+              <w:rPr>
+                <w:rFonts w:asciiTheme="minorHAnsi" w:hAnsiTheme="minorHAnsi" w:cstheme="minorHAnsi"/>
+                <w:color w:val="000000" w:themeColor="text1"/>
+                <w:sz w:val="22"/>
+                <w:szCs w:val="22"/>
+              </w:rPr>
+              <w:t>, debe mencionarse que deben permanecer libres de obstáculos permanentemente, aún en áreas de ingreso egreso en tiempo menor o provisional en el tramo de ingreso.</w:t>
             </w:r>
           </w:p>
         </w:tc>
@@ -657,7 +853,7 @@
             <w:pPr>
               <w:pStyle w:val="Default"/>
               <w:spacing w:line="360" w:lineRule="auto"/>
-              <w:jc w:val="both"/>
+              <w:jc w:val="center"/>
               <w:rPr>
                 <w:rFonts w:asciiTheme="minorHAnsi" w:hAnsiTheme="minorHAnsi" w:cstheme="minorHAnsi"/>
                 <w:color w:val="000000" w:themeColor="text1"/>
@@ -665,6 +861,7 @@
                 <w:szCs w:val="22"/>
               </w:rPr>
             </w:pPr>
+            <w:proofErr w:type="gramStart"/>
             <w:r>
               <w:rPr>
                 <w:rFonts w:asciiTheme="minorHAnsi" w:hAnsiTheme="minorHAnsi" w:cstheme="minorHAnsi"/>
@@ -672,8 +869,9 @@
                 <w:sz w:val="22"/>
                 <w:szCs w:val="22"/>
               </w:rPr>
-              <w:t>Las vías de evacuación, tanto verticales y horizontales se encuentran calculadas para una correcta evacuación d</w:t>
-            </w:r>
+              <w:t>{{ ruta</w:t>
+            </w:r>
+            <w:proofErr w:type="gramEnd"/>
             <w:r>
               <w:rPr>
                 <w:rFonts w:asciiTheme="minorHAnsi" w:hAnsiTheme="minorHAnsi" w:cstheme="minorHAnsi"/>
@@ -681,16 +879,7 @@
                 <w:sz w:val="22"/>
                 <w:szCs w:val="22"/>
               </w:rPr>
-              <w:t>el inmueble</w:t>
-            </w:r>
-            <w:r>
-              <w:rPr>
-                <w:rFonts w:asciiTheme="minorHAnsi" w:hAnsiTheme="minorHAnsi" w:cstheme="minorHAnsi"/>
-                <w:color w:val="000000" w:themeColor="text1"/>
-                <w:sz w:val="22"/>
-                <w:szCs w:val="22"/>
-              </w:rPr>
-              <w:t>, debe mencionarse que deben permanecer libres de obstáculos permanentemente, aún en áreas de ingreso egreso en tiempo menor o provisional en el tramo de ingreso.</w:t>
+              <w:t>1 }}</w:t>
             </w:r>
           </w:p>
         </w:tc>
@@ -719,9 +908,8 @@
                 <w:sz w:val="22"/>
                 <w:szCs w:val="22"/>
               </w:rPr>
-              <w:t>{{ ruta</w:t>
-            </w:r>
-            <w:proofErr w:type="gramEnd"/>
+              <w:t xml:space="preserve">{{ </w:t>
+            </w:r>
             <w:r>
               <w:rPr>
                 <w:rFonts w:asciiTheme="minorHAnsi" w:hAnsiTheme="minorHAnsi" w:cstheme="minorHAnsi"/>
@@ -729,8 +917,9 @@
                 <w:sz w:val="22"/>
                 <w:szCs w:val="22"/>
               </w:rPr>
-              <w:t>1</w:t>
-            </w:r>
+              <w:t>ruta</w:t>
+            </w:r>
+            <w:proofErr w:type="gramEnd"/>
             <w:r>
               <w:rPr>
                 <w:rFonts w:asciiTheme="minorHAnsi" w:hAnsiTheme="minorHAnsi" w:cstheme="minorHAnsi"/>
@@ -738,7 +927,133 @@
                 <w:sz w:val="22"/>
                 <w:szCs w:val="22"/>
               </w:rPr>
+              <w:t>4</w:t>
+            </w:r>
+            <w:r>
+              <w:rPr>
+                <w:rFonts w:asciiTheme="minorHAnsi" w:hAnsiTheme="minorHAnsi" w:cstheme="minorHAnsi"/>
+                <w:color w:val="000000" w:themeColor="text1"/>
+                <w:sz w:val="22"/>
+                <w:szCs w:val="22"/>
+              </w:rPr>
               <w:t xml:space="preserve"> }}</w:t>
+            </w:r>
+          </w:p>
+        </w:tc>
+      </w:tr>
+      <w:tr>
+        <w:trPr>
+          <w:trHeight w:val="20"/>
+        </w:trPr>
+        <w:tc>
+          <w:tcPr>
+            <w:tcW w:w="4416" w:type="dxa"/>
+            <w:vAlign w:val="center"/>
+          </w:tcPr>
+          <w:p>
+            <w:pPr>
+              <w:pStyle w:val="Default"/>
+              <w:jc w:val="center"/>
+              <w:rPr>
+                <w:rFonts w:asciiTheme="minorHAnsi" w:hAnsiTheme="minorHAnsi" w:cstheme="minorHAnsi"/>
+                <w:color w:val="000000" w:themeColor="text1"/>
+                <w:sz w:val="22"/>
+                <w:szCs w:val="22"/>
+              </w:rPr>
+            </w:pPr>
+          </w:p>
+        </w:tc>
+        <w:tc>
+          <w:tcPr>
+            <w:tcW w:w="4417" w:type="dxa"/>
+            <w:vAlign w:val="center"/>
+          </w:tcPr>
+          <w:p>
+            <w:pPr>
+              <w:pStyle w:val="Default"/>
+              <w:jc w:val="center"/>
+              <w:rPr>
+                <w:rFonts w:asciiTheme="minorHAnsi" w:hAnsiTheme="minorHAnsi" w:cstheme="minorHAnsi"/>
+                <w:color w:val="000000" w:themeColor="text1"/>
+                <w:sz w:val="22"/>
+                <w:szCs w:val="22"/>
+              </w:rPr>
+            </w:pPr>
+          </w:p>
+        </w:tc>
+      </w:tr>
+      <w:tr>
+        <w:trPr>
+          <w:trHeight w:val="3288"/>
+        </w:trPr>
+        <w:tc>
+          <w:tcPr>
+            <w:tcW w:w="4416" w:type="dxa"/>
+            <w:vAlign w:val="center"/>
+          </w:tcPr>
+          <w:p>
+            <w:pPr>
+              <w:pStyle w:val="Prrafodelista"/>
+              <w:spacing w:after="0" w:line="360" w:lineRule="auto"/>
+              <w:ind w:left="0"/>
+              <w:jc w:val="both"/>
+              <w:rPr>
+                <w:rFonts w:cstheme="minorHAnsi"/>
+                <w:color w:val="000000" w:themeColor="text1"/>
+                <w:sz w:val="20"/>
+                <w:szCs w:val="20"/>
+              </w:rPr>
+            </w:pPr>
+            <w:r>
+              <w:t>Las salidas de emergencia se encuentran diseñadas y calculadas para permitir una evacuación segura y eficiente del inmueble. Es importante señalar que dichas salidas deben permanecer libres de cualquier tipo de obstrucción en todo momento, incluyendo aquellas zonas utilizadas para ingreso o egreso, garantizando así su operatividad inmediata en caso de una emergencia.</w:t>
+            </w:r>
+          </w:p>
+        </w:tc>
+        <w:tc>
+          <w:tcPr>
+            <w:tcW w:w="4417" w:type="dxa"/>
+            <w:vAlign w:val="center"/>
+          </w:tcPr>
+          <w:p>
+            <w:pPr>
+              <w:pStyle w:val="Prrafodelista"/>
+              <w:spacing w:after="0" w:line="240" w:lineRule="auto"/>
+              <w:ind w:left="0"/>
+              <w:jc w:val="center"/>
+              <w:rPr>
+                <w:rFonts w:cstheme="minorHAnsi"/>
+                <w:color w:val="000000" w:themeColor="text1"/>
+              </w:rPr>
+            </w:pPr>
+            <w:proofErr w:type="gramStart"/>
+            <w:r>
+              <w:rPr>
+                <w:rFonts w:cstheme="minorHAnsi"/>
+                <w:color w:val="000000" w:themeColor="text1"/>
+              </w:rPr>
+              <w:t xml:space="preserve">{{ </w:t>
+            </w:r>
+            <w:r>
+              <w:rPr>
+                <w:rFonts w:cstheme="minorHAnsi"/>
+                <w:color w:val="000000" w:themeColor="text1"/>
+              </w:rPr>
+              <w:t>salida</w:t>
+            </w:r>
+            <w:proofErr w:type="gramEnd"/>
+            <w:r>
+              <w:rPr>
+                <w:rFonts w:cstheme="minorHAnsi"/>
+                <w:color w:val="000000" w:themeColor="text1"/>
+              </w:rPr>
+              <w:t xml:space="preserve"> </w:t>
+            </w:r>
+            <w:r>
+              <w:rPr>
+                <w:rFonts w:cstheme="minorHAnsi"/>
+                <w:color w:val="000000" w:themeColor="text1"/>
+              </w:rPr>
+              <w:t>}}</w:t>
             </w:r>
           </w:p>
         </w:tc>
@@ -787,50 +1102,12 @@
       </w:tblGrid>
       <w:tr>
         <w:trPr>
-          <w:trHeight w:val="3288"/>
+          <w:trHeight w:val="1701"/>
         </w:trPr>
         <w:tc>
           <w:tcPr>
-            <w:tcW w:w="4414" w:type="dxa"/>
-            <w:vAlign w:val="center"/>
-          </w:tcPr>
-          <w:p>
-            <w:pPr>
-              <w:pStyle w:val="Prrafodelista"/>
-              <w:spacing w:line="360" w:lineRule="auto"/>
-              <w:ind w:left="0"/>
-              <w:jc w:val="both"/>
-              <w:rPr>
-                <w:rFonts w:cstheme="minorHAnsi"/>
-                <w:color w:val="000000" w:themeColor="text1"/>
-              </w:rPr>
-            </w:pPr>
-            <w:r>
-              <w:rPr>
-                <w:rFonts w:cstheme="minorHAnsi"/>
-                <w:color w:val="000000" w:themeColor="text1"/>
-              </w:rPr>
-              <w:t xml:space="preserve">El botiquín cuenta con material de curación (NO DEBE CONTENER MEDICAMENTO DE ACUERDO </w:t>
-            </w:r>
-            <w:r>
-              <w:rPr>
-                <w:rFonts w:cstheme="minorHAnsi"/>
-                <w:color w:val="000000" w:themeColor="text1"/>
-              </w:rPr>
-              <w:t>CON</w:t>
-            </w:r>
-            <w:r>
-              <w:rPr>
-                <w:rFonts w:cstheme="minorHAnsi"/>
-                <w:color w:val="000000" w:themeColor="text1"/>
-              </w:rPr>
-              <w:t xml:space="preserve"> LA NOM-030-STPS-2009 Y NOM-020-STPS-1994) debe contar con bitácora de mantenimiento a cargo de la brigada de Primeros auxilios indicación actual.</w:t>
-            </w:r>
-          </w:p>
-        </w:tc>
-        <w:tc>
-          <w:tcPr>
-            <w:tcW w:w="4414" w:type="dxa"/>
+            <w:tcW w:w="8828" w:type="dxa"/>
+            <w:gridSpan w:val="2"/>
             <w:vAlign w:val="center"/>
           </w:tcPr>
           <w:p>
@@ -838,77 +1115,33 @@
               <w:pStyle w:val="Prrafodelista"/>
               <w:spacing w:after="0" w:line="360" w:lineRule="auto"/>
               <w:ind w:left="0"/>
-              <w:jc w:val="center"/>
+              <w:jc w:val="both"/>
               <w:rPr>
                 <w:rFonts w:cstheme="minorHAnsi"/>
                 <w:color w:val="000000" w:themeColor="text1"/>
               </w:rPr>
             </w:pPr>
-            <w:proofErr w:type="gramStart"/>
             <w:r>
               <w:rPr>
                 <w:rFonts w:cstheme="minorHAnsi"/>
                 <w:color w:val="000000" w:themeColor="text1"/>
               </w:rPr>
-              <w:t xml:space="preserve">{{ </w:t>
-            </w:r>
-            <w:proofErr w:type="spellStart"/>
+              <w:t xml:space="preserve">El botiquín cuenta con material de curación (NO DEBE CONTENER MEDICAMENTO DE ACUERDO </w:t>
+            </w:r>
             <w:r>
               <w:rPr>
                 <w:rFonts w:cstheme="minorHAnsi"/>
                 <w:color w:val="000000" w:themeColor="text1"/>
               </w:rPr>
-              <w:t>botiquin</w:t>
-            </w:r>
-            <w:proofErr w:type="spellEnd"/>
-            <w:proofErr w:type="gramEnd"/>
+              <w:t>CON</w:t>
+            </w:r>
             <w:r>
               <w:rPr>
                 <w:rFonts w:cstheme="minorHAnsi"/>
                 <w:color w:val="000000" w:themeColor="text1"/>
               </w:rPr>
-              <w:t xml:space="preserve"> }}</w:t>
-            </w:r>
-          </w:p>
-        </w:tc>
-      </w:tr>
-      <w:tr>
-        <w:tc>
-          <w:tcPr>
-            <w:tcW w:w="4414" w:type="dxa"/>
-            <w:vAlign w:val="center"/>
-          </w:tcPr>
-          <w:p>
-            <w:pPr>
-              <w:pStyle w:val="Prrafodelista"/>
-              <w:spacing w:line="240" w:lineRule="auto"/>
-              <w:ind w:left="0"/>
-              <w:jc w:val="both"/>
-              <w:rPr>
-                <w:sz w:val="20"/>
-                <w:szCs w:val="20"/>
-              </w:rPr>
-            </w:pPr>
-          </w:p>
-        </w:tc>
-        <w:tc>
-          <w:tcPr>
-            <w:tcW w:w="4414" w:type="dxa"/>
-            <w:vAlign w:val="center"/>
-          </w:tcPr>
-          <w:p>
-            <w:pPr>
-              <w:pStyle w:val="Prrafodelista"/>
-              <w:spacing w:after="0" w:line="240" w:lineRule="auto"/>
-              <w:ind w:left="0"/>
-              <w:jc w:val="center"/>
-              <w:rPr>
-                <w:rFonts w:cstheme="minorHAnsi"/>
-                <w:color w:val="000000" w:themeColor="text1"/>
-                <w:sz w:val="20"/>
-                <w:szCs w:val="20"/>
-              </w:rPr>
-            </w:pPr>
+              <w:t xml:space="preserve"> LA NOM-030-STPS-2009 Y NOM-020-STPS-1994) debe contar con bitácora de mantenimiento a cargo de la brigada de Primeros auxilios indicación actual.</w:t>
+            </w:r>
           </w:p>
         </w:tc>
       </w:tr>
@@ -926,37 +1159,36 @@
               <w:pStyle w:val="Prrafodelista"/>
               <w:spacing w:line="360" w:lineRule="auto"/>
               <w:ind w:left="0"/>
-              <w:jc w:val="both"/>
+              <w:jc w:val="center"/>
               <w:rPr>
                 <w:rFonts w:cstheme="minorHAnsi"/>
                 <w:color w:val="000000" w:themeColor="text1"/>
               </w:rPr>
             </w:pPr>
+            <w:proofErr w:type="gramStart"/>
             <w:r>
               <w:rPr>
                 <w:rFonts w:cstheme="minorHAnsi"/>
                 <w:color w:val="000000" w:themeColor="text1"/>
               </w:rPr>
-              <w:t xml:space="preserve">La señalización, se recomienda colocar a una altura de </w:t>
-            </w:r>
-            <w:smartTag w:uri="urn:schemas-microsoft-com:office:smarttags" w:element="metricconverter">
-              <w:smartTagPr>
-                <w:attr w:name="ProductID" w:val="1.50 metros"/>
-              </w:smartTagPr>
-              <w:r>
-                <w:rPr>
-                  <w:rFonts w:cstheme="minorHAnsi"/>
-                  <w:color w:val="000000" w:themeColor="text1"/>
-                </w:rPr>
-                <w:t>1.50 metros</w:t>
-              </w:r>
-            </w:smartTag>
+              <w:t xml:space="preserve">{{ </w:t>
+            </w:r>
+            <w:proofErr w:type="spellStart"/>
             <w:r>
               <w:rPr>
                 <w:rFonts w:cstheme="minorHAnsi"/>
                 <w:color w:val="000000" w:themeColor="text1"/>
               </w:rPr>
-              <w:t xml:space="preserve"> de acuerdo con NOM 003 SEGOB 2002 Señales y avisos, cuenta en cantidad y calidad óptima de acuerdo con usos de espacios para un mejor desarrollo del plan de evacuación.</w:t>
+              <w:t>botiquin</w:t>
+            </w:r>
+            <w:proofErr w:type="spellEnd"/>
+            <w:proofErr w:type="gramEnd"/>
+            <w:r>
+              <w:rPr>
+                <w:rFonts w:cstheme="minorHAnsi"/>
+                <w:color w:val="000000" w:themeColor="text1"/>
+              </w:rPr>
+              <w:t xml:space="preserve"> }}</w:t>
             </w:r>
           </w:p>
         </w:tc>
@@ -982,7 +1214,7 @@
                 <w:rFonts w:cstheme="minorHAnsi"/>
                 <w:color w:val="000000" w:themeColor="text1"/>
               </w:rPr>
-              <w:t>{{ ruta</w:t>
+              <w:t>{{ botiquin</w:t>
             </w:r>
             <w:proofErr w:type="gramEnd"/>
             <w:r>
@@ -990,15 +1222,19 @@
                 <w:rFonts w:cstheme="minorHAnsi"/>
                 <w:color w:val="000000" w:themeColor="text1"/>
               </w:rPr>
-              <w:t>2 }}</w:t>
+              <w:t>1</w:t>
+            </w:r>
+            <w:r>
+              <w:rPr>
+                <w:rFonts w:cstheme="minorHAnsi"/>
+                <w:color w:val="000000" w:themeColor="text1"/>
+              </w:rPr>
+              <w:t xml:space="preserve"> }}</w:t>
             </w:r>
           </w:p>
         </w:tc>
       </w:tr>
       <w:tr>
-        <w:trPr>
-          <w:trHeight w:val="57"/>
-        </w:trPr>
         <w:tc>
           <w:tcPr>
             <w:tcW w:w="4414" w:type="dxa"/>
@@ -1007,12 +1243,10 @@
           <w:p>
             <w:pPr>
               <w:pStyle w:val="Prrafodelista"/>
-              <w:spacing w:after="0" w:line="240" w:lineRule="auto"/>
+              <w:spacing w:line="240" w:lineRule="auto"/>
               <w:ind w:left="0"/>
-              <w:jc w:val="center"/>
-              <w:rPr>
-                <w:rFonts w:cstheme="minorHAnsi"/>
-                <w:color w:val="000000" w:themeColor="text1"/>
+              <w:jc w:val="both"/>
+              <w:rPr>
                 <w:sz w:val="20"/>
                 <w:szCs w:val="20"/>
               </w:rPr>
@@ -1037,6 +1271,56 @@
                 <w:szCs w:val="20"/>
               </w:rPr>
             </w:pPr>
+          </w:p>
+        </w:tc>
+      </w:tr>
+      <w:tr>
+        <w:trPr>
+          <w:trHeight w:val="1701"/>
+        </w:trPr>
+        <w:tc>
+          <w:tcPr>
+            <w:tcW w:w="8828" w:type="dxa"/>
+            <w:gridSpan w:val="2"/>
+            <w:vAlign w:val="center"/>
+          </w:tcPr>
+          <w:p>
+            <w:pPr>
+              <w:pStyle w:val="Prrafodelista"/>
+              <w:spacing w:after="0" w:line="360" w:lineRule="auto"/>
+              <w:ind w:left="0"/>
+              <w:jc w:val="both"/>
+              <w:rPr>
+                <w:rFonts w:cstheme="minorHAnsi"/>
+                <w:color w:val="000000" w:themeColor="text1"/>
+              </w:rPr>
+            </w:pPr>
+            <w:r>
+              <w:rPr>
+                <w:rFonts w:cstheme="minorHAnsi"/>
+                <w:color w:val="000000" w:themeColor="text1"/>
+              </w:rPr>
+              <w:t xml:space="preserve">La señalización, se recomienda colocar a una altura de </w:t>
+            </w:r>
+            <w:smartTag w:uri="urn:schemas-microsoft-com:office:smarttags" w:element="metricconverter">
+              <w:smartTagPr>
+                <w:attr w:name="ProductID" w:val="1.50 metros"/>
+              </w:smartTagPr>
+              <w:r>
+                <w:rPr>
+                  <w:rFonts w:cstheme="minorHAnsi"/>
+                  <w:color w:val="000000" w:themeColor="text1"/>
+                </w:rPr>
+                <w:t>1.50 metros</w:t>
+              </w:r>
+            </w:smartTag>
+            <w:r>
+              <w:rPr>
+                <w:rFonts w:cstheme="minorHAnsi"/>
+                <w:color w:val="000000" w:themeColor="text1"/>
+              </w:rPr>
+              <w:t xml:space="preserve"> de acuerdo con NOM 003 SEGOB 2002 Señales y avisos, cuenta en cantidad y calidad óptima de acuerdo con usos de espacios para un mejor desarrollo del plan de evacuación.</w:t>
+            </w:r>
           </w:p>
         </w:tc>
       </w:tr>
@@ -1052,105 +1336,29 @@
           <w:p>
             <w:pPr>
               <w:pStyle w:val="Prrafodelista"/>
-              <w:spacing w:after="0" w:line="360" w:lineRule="auto"/>
+              <w:spacing w:line="360" w:lineRule="auto"/>
               <w:ind w:left="0"/>
-              <w:jc w:val="both"/>
+              <w:jc w:val="center"/>
               <w:rPr>
                 <w:rFonts w:cstheme="minorHAnsi"/>
                 <w:color w:val="000000" w:themeColor="text1"/>
               </w:rPr>
             </w:pPr>
+            <w:proofErr w:type="gramStart"/>
             <w:r>
               <w:rPr>
                 <w:rFonts w:cstheme="minorHAnsi"/>
-                <w:noProof/>
-                <w:color w:val="000000" w:themeColor="text1"/>
-                <w:lang w:eastAsia="es-MX"/>
-              </w:rPr>
-              <w:t>C</w:t>
-            </w:r>
+                <w:color w:val="000000" w:themeColor="text1"/>
+              </w:rPr>
+              <w:t>{{ ruta</w:t>
+            </w:r>
+            <w:proofErr w:type="gramEnd"/>
             <w:r>
               <w:rPr>
                 <w:rFonts w:cstheme="minorHAnsi"/>
-                <w:noProof/>
-                <w:color w:val="000000" w:themeColor="text1"/>
-                <w:lang w:eastAsia="es-MX"/>
-              </w:rPr>
-              <w:t>uenta</w:t>
-            </w:r>
-            <w:r>
-              <w:rPr>
-                <w:rFonts w:cstheme="minorHAnsi"/>
-                <w:color w:val="000000" w:themeColor="text1"/>
-              </w:rPr>
-              <w:t xml:space="preserve"> con sistema de </w:t>
-            </w:r>
-            <w:r>
-              <w:rPr>
-                <w:rFonts w:cstheme="minorHAnsi"/>
-                <w:b/>
-                <w:color w:val="000000" w:themeColor="text1"/>
-              </w:rPr>
-              <w:t>al</w:t>
-            </w:r>
-            <w:r>
-              <w:rPr>
-                <w:rFonts w:cstheme="minorHAnsi"/>
-                <w:b/>
-                <w:color w:val="000000" w:themeColor="text1"/>
-              </w:rPr>
-              <w:t>a</w:t>
-            </w:r>
-            <w:r>
-              <w:rPr>
-                <w:rFonts w:cstheme="minorHAnsi"/>
-                <w:b/>
-                <w:color w:val="000000" w:themeColor="text1"/>
-              </w:rPr>
-              <w:t>r</w:t>
-            </w:r>
-            <w:r>
-              <w:rPr>
-                <w:rFonts w:cstheme="minorHAnsi"/>
-                <w:b/>
-                <w:color w:val="000000" w:themeColor="text1"/>
-              </w:rPr>
-              <w:t>ma</w:t>
-            </w:r>
-            <w:r>
-              <w:rPr>
-                <w:rFonts w:cstheme="minorHAnsi"/>
-                <w:color w:val="000000" w:themeColor="text1"/>
-              </w:rPr>
-              <w:t xml:space="preserve"> en caso de </w:t>
-            </w:r>
-            <w:r>
-              <w:rPr>
-                <w:rFonts w:cstheme="minorHAnsi"/>
-                <w:color w:val="000000" w:themeColor="text1"/>
-              </w:rPr>
-              <w:t>emergencia</w:t>
-            </w:r>
-            <w:r>
-              <w:rPr>
-                <w:rFonts w:cstheme="minorHAnsi"/>
-                <w:color w:val="000000" w:themeColor="text1"/>
-              </w:rPr>
-              <w:t xml:space="preserve">, se recomienda </w:t>
-            </w:r>
-            <w:r>
-              <w:rPr>
-                <w:rFonts w:cstheme="minorHAnsi"/>
-                <w:color w:val="000000" w:themeColor="text1"/>
-              </w:rPr>
-              <w:t>realizar inspección de manera regular para garantizar su buen funcionamiento</w:t>
-            </w:r>
-            <w:r>
-              <w:rPr>
-                <w:rFonts w:cstheme="minorHAnsi"/>
-                <w:color w:val="000000" w:themeColor="text1"/>
-              </w:rPr>
-              <w:t>.</w:t>
+                <w:color w:val="000000" w:themeColor="text1"/>
+              </w:rPr>
+              <w:t>2 }}</w:t>
             </w:r>
           </w:p>
         </w:tc>
@@ -1176,9 +1384,16 @@
                 <w:rFonts w:cstheme="minorHAnsi"/>
                 <w:color w:val="000000" w:themeColor="text1"/>
               </w:rPr>
-              <w:t>{{ alarma</w:t>
+              <w:t>{{ ruta</w:t>
             </w:r>
             <w:proofErr w:type="gramEnd"/>
+            <w:r>
+              <w:rPr>
+                <w:rFonts w:cstheme="minorHAnsi"/>
+                <w:color w:val="000000" w:themeColor="text1"/>
+              </w:rPr>
+              <w:t>3</w:t>
+            </w:r>
             <w:r>
               <w:rPr>
                 <w:rFonts w:cstheme="minorHAnsi"/>
@@ -1254,37 +1469,94 @@
             <w:r>
               <w:rPr>
                 <w:rFonts w:cstheme="minorHAnsi"/>
-                <w:color w:val="000000" w:themeColor="text1"/>
-              </w:rPr>
-              <w:t xml:space="preserve">Cuenta con señales informativas </w:t>
+                <w:noProof/>
+                <w:color w:val="000000" w:themeColor="text1"/>
+                <w:lang w:eastAsia="es-MX"/>
+              </w:rPr>
+              <w:t>C</w:t>
             </w:r>
             <w:r>
               <w:rPr>
                 <w:rFonts w:cstheme="minorHAnsi"/>
-                <w:color w:val="000000" w:themeColor="text1"/>
-              </w:rPr>
-              <w:t xml:space="preserve">de que hacer en caso de sismo e incendio </w:t>
+                <w:noProof/>
+                <w:color w:val="000000" w:themeColor="text1"/>
+                <w:lang w:eastAsia="es-MX"/>
+              </w:rPr>
+              <w:t>uenta</w:t>
             </w:r>
             <w:r>
               <w:rPr>
                 <w:rFonts w:cstheme="minorHAnsi"/>
                 <w:color w:val="000000" w:themeColor="text1"/>
               </w:rPr>
-              <w:t xml:space="preserve">con instrucciones claras sobre procedimientos de seguridad en caso de sismo o incendio, se sugiere </w:t>
+              <w:t xml:space="preserve"> con sistema de </w:t>
             </w:r>
             <w:r>
               <w:rPr>
                 <w:rFonts w:cstheme="minorHAnsi"/>
-                <w:color w:val="000000" w:themeColor="text1"/>
-              </w:rPr>
-              <w:t>mantener</w:t>
+                <w:b/>
+                <w:color w:val="000000" w:themeColor="text1"/>
+              </w:rPr>
+              <w:t>al</w:t>
             </w:r>
             <w:r>
               <w:rPr>
                 <w:rFonts w:cstheme="minorHAnsi"/>
-                <w:color w:val="000000" w:themeColor="text1"/>
-              </w:rPr>
-              <w:t xml:space="preserve"> su correcta ubicación.</w:t>
+                <w:b/>
+                <w:color w:val="000000" w:themeColor="text1"/>
+              </w:rPr>
+              <w:t>a</w:t>
+            </w:r>
+            <w:r>
+              <w:rPr>
+                <w:rFonts w:cstheme="minorHAnsi"/>
+                <w:b/>
+                <w:color w:val="000000" w:themeColor="text1"/>
+              </w:rPr>
+              <w:t>r</w:t>
+            </w:r>
+            <w:r>
+              <w:rPr>
+                <w:rFonts w:cstheme="minorHAnsi"/>
+                <w:b/>
+                <w:color w:val="000000" w:themeColor="text1"/>
+              </w:rPr>
+              <w:t>ma</w:t>
+            </w:r>
+            <w:r>
+              <w:rPr>
+                <w:rFonts w:cstheme="minorHAnsi"/>
+                <w:color w:val="000000" w:themeColor="text1"/>
+              </w:rPr>
+              <w:t xml:space="preserve"> en caso de </w:t>
+            </w:r>
+            <w:r>
+              <w:rPr>
+                <w:rFonts w:cstheme="minorHAnsi"/>
+                <w:color w:val="000000" w:themeColor="text1"/>
+              </w:rPr>
+              <w:t>emergencia</w:t>
+            </w:r>
+            <w:r>
+              <w:rPr>
+                <w:rFonts w:cstheme="minorHAnsi"/>
+                <w:color w:val="000000" w:themeColor="text1"/>
+              </w:rPr>
+              <w:t xml:space="preserve">, se recomienda </w:t>
+            </w:r>
+            <w:r>
+              <w:rPr>
+                <w:rFonts w:cstheme="minorHAnsi"/>
+                <w:color w:val="000000" w:themeColor="text1"/>
+              </w:rPr>
+              <w:t>realizar inspección de manera regular para garantizar su buen funcionamiento</w:t>
+            </w:r>
+            <w:r>
+              <w:rPr>
+                <w:rFonts w:cstheme="minorHAnsi"/>
+                <w:color w:val="000000" w:themeColor="text1"/>
+              </w:rPr>
+              <w:t>.</w:t>
             </w:r>
           </w:p>
         </w:tc>
@@ -1306,18 +1578,18 @@
             </w:pPr>
             <w:proofErr w:type="gramStart"/>
             <w:r>
-              <w:t xml:space="preserve">{{ </w:t>
-            </w:r>
-            <w:proofErr w:type="spellStart"/>
-            <w:r>
-              <w:t>sis</w:t>
+              <w:rPr>
+                <w:rFonts w:cstheme="minorHAnsi"/>
+                <w:color w:val="000000" w:themeColor="text1"/>
+              </w:rPr>
+              <w:t>{{ alarma</w:t>
             </w:r>
             <w:proofErr w:type="gramEnd"/>
             <w:r>
-              <w:t>_inc</w:t>
-            </w:r>
-            <w:proofErr w:type="spellEnd"/>
-            <w:r>
+              <w:rPr>
+                <w:rFonts w:cstheme="minorHAnsi"/>
+                <w:color w:val="000000" w:themeColor="text1"/>
+              </w:rPr>
               <w:t xml:space="preserve"> }}</w:t>
             </w:r>
           </w:p>
@@ -1330,7 +1602,6 @@
         <w:tc>
           <w:tcPr>
             <w:tcW w:w="4414" w:type="dxa"/>
-            <w:vAlign w:val="center"/>
           </w:tcPr>
           <w:p>
             <w:pPr>
@@ -1350,7 +1621,6 @@
         <w:tc>
           <w:tcPr>
             <w:tcW w:w="4414" w:type="dxa"/>
-            <w:vAlign w:val="center"/>
           </w:tcPr>
           <w:p>
             <w:pPr>
@@ -1380,7 +1650,6 @@
               <w:pStyle w:val="Prrafodelista"/>
               <w:spacing w:after="0" w:line="360" w:lineRule="auto"/>
               <w:ind w:left="0"/>
-              <w:jc w:val="both"/>
               <w:rPr>
                 <w:rFonts w:cstheme="minorHAnsi"/>
                 <w:color w:val="000000" w:themeColor="text1"/>
@@ -1470,6 +1739,9 @@
         </w:tc>
       </w:tr>
       <w:tr>
+        <w:trPr>
+          <w:trHeight w:val="20"/>
+        </w:trPr>
         <w:tc>
           <w:tcPr>
             <w:tcW w:w="4414" w:type="dxa"/>
@@ -1480,10 +1752,11 @@
               <w:pStyle w:val="Prrafodelista"/>
               <w:spacing w:after="0" w:line="240" w:lineRule="auto"/>
               <w:ind w:left="0"/>
-              <w:jc w:val="both"/>
-              <w:rPr>
-                <w:sz w:val="20"/>
-                <w:szCs w:val="20"/>
+              <w:rPr>
+                <w:rFonts w:cstheme="minorHAnsi"/>
+                <w:noProof/>
+                <w:color w:val="000000" w:themeColor="text1"/>
+                <w:lang w:eastAsia="es-MX"/>
               </w:rPr>
             </w:pPr>
           </w:p>
@@ -1499,10 +1772,6 @@
               <w:spacing w:after="0" w:line="240" w:lineRule="auto"/>
               <w:ind w:left="0"/>
               <w:jc w:val="center"/>
-              <w:rPr>
-                <w:sz w:val="20"/>
-                <w:szCs w:val="20"/>
-              </w:rPr>
             </w:pPr>
           </w:p>
         </w:tc>
@@ -1514,7 +1783,6 @@
         <w:tc>
           <w:tcPr>
             <w:tcW w:w="4414" w:type="dxa"/>
-            <w:vAlign w:val="center"/>
           </w:tcPr>
           <w:p>
             <w:pPr>
@@ -1522,15 +1790,33 @@
               <w:spacing w:after="0" w:line="360" w:lineRule="auto"/>
               <w:ind w:left="0"/>
               <w:jc w:val="both"/>
+              <w:rPr>
+                <w:rFonts w:cstheme="minorHAnsi"/>
+                <w:color w:val="000000" w:themeColor="text1"/>
+              </w:rPr>
             </w:pPr>
             <w:r>
-              <w:t xml:space="preserve">Cuenta con un área específica identificada </w:t>
-            </w:r>
-            <w:r>
-              <w:t xml:space="preserve">como zona de menor riesgo </w:t>
-            </w:r>
-            <w:r>
-              <w:t>para proporcionar resguardo temporal durante eventos peligrosos como sismos, se recomienda asegurar su visibilidad y accesibilidad conforme a los planes de emergencia establecidos.</w:t>
+              <w:rPr>
+                <w:rFonts w:cstheme="minorHAnsi"/>
+                <w:color w:val="000000" w:themeColor="text1"/>
+              </w:rPr>
+              <w:t>Se recomienda que las instalaciones, se mantengan siempre sin llave hasta el cese de actividades diarias, libres de obstáculos.</w:t>
+            </w:r>
+            <w:r>
+              <w:rPr>
+                <w:rFonts w:cstheme="minorHAnsi"/>
+                <w:noProof/>
+                <w:color w:val="000000" w:themeColor="text1"/>
+                <w:lang w:eastAsia="es-MX"/>
+              </w:rPr>
+              <w:t xml:space="preserve">  </w:t>
+            </w:r>
+            <w:r>
+              <w:rPr>
+                <w:rFonts w:cstheme="minorHAnsi"/>
+                <w:color w:val="000000" w:themeColor="text1"/>
+              </w:rPr>
+              <w:t>Revisar la disposición de objetos no empotrados y que puedan volcarse, plafones que presentan humedad, pueden caer o deslizarse en caso de sismo, ubicados en zona de tránsito peatonal, así como la disposición de pesos en su almacenaje.</w:t>
             </w:r>
           </w:p>
         </w:tc>
@@ -1552,18 +1838,18 @@
             </w:pPr>
             <w:proofErr w:type="gramStart"/>
             <w:r>
-              <w:t xml:space="preserve">{{ </w:t>
-            </w:r>
-            <w:proofErr w:type="spellStart"/>
-            <w:r>
-              <w:t>zona</w:t>
+              <w:rPr>
+                <w:rFonts w:cstheme="minorHAnsi"/>
+                <w:color w:val="000000" w:themeColor="text1"/>
+              </w:rPr>
+              <w:t>{{ puerta</w:t>
             </w:r>
             <w:proofErr w:type="gramEnd"/>
             <w:r>
-              <w:t>_sec</w:t>
-            </w:r>
-            <w:proofErr w:type="spellEnd"/>
-            <w:r>
+              <w:rPr>
+                <w:rFonts w:cstheme="minorHAnsi"/>
+                <w:color w:val="000000" w:themeColor="text1"/>
+              </w:rPr>
               <w:t xml:space="preserve"> }}</w:t>
             </w:r>
           </w:p>
@@ -1613,11 +1899,12 @@
       </w:tblGrid>
       <w:tr>
         <w:trPr>
-          <w:trHeight w:val="3288"/>
+          <w:trHeight w:val="1701"/>
         </w:trPr>
         <w:tc>
           <w:tcPr>
-            <w:tcW w:w="4414" w:type="dxa"/>
+            <w:tcW w:w="8828" w:type="dxa"/>
+            <w:gridSpan w:val="2"/>
             <w:vAlign w:val="center"/>
           </w:tcPr>
           <w:p>
@@ -1629,96 +1916,43 @@
               <w:rPr>
                 <w:rFonts w:cstheme="minorHAnsi"/>
                 <w:color w:val="000000" w:themeColor="text1"/>
-                <w:sz w:val="20"/>
-                <w:szCs w:val="20"/>
               </w:rPr>
             </w:pPr>
             <w:r>
-              <w:t xml:space="preserve">Las salidas de </w:t>
-            </w:r>
-            <w:r>
-              <w:t>emergencia</w:t>
-            </w:r>
-            <w:r>
-              <w:t xml:space="preserve"> se encuentran diseñadas y calculadas para permitir una evacuación segura y eficiente del inmueble. Es importante señalar que dichas salidas deben permanecer libres de cualquier tipo de obstrucción en todo momento, incluyendo aquellas zonas utilizadas para ingreso o egreso, garantizando así su operatividad inmediata en caso de una emergencia.</w:t>
-            </w:r>
-          </w:p>
-        </w:tc>
-        <w:tc>
-          <w:tcPr>
-            <w:tcW w:w="4414" w:type="dxa"/>
-            <w:vAlign w:val="center"/>
-          </w:tcPr>
-          <w:p>
-            <w:pPr>
-              <w:pStyle w:val="Prrafodelista"/>
-              <w:spacing w:after="0" w:line="240" w:lineRule="auto"/>
-              <w:ind w:left="0"/>
-              <w:jc w:val="center"/>
               <w:rPr>
                 <w:rFonts w:cstheme="minorHAnsi"/>
                 <w:color w:val="000000" w:themeColor="text1"/>
               </w:rPr>
-            </w:pPr>
-            <w:proofErr w:type="gramStart"/>
+              <w:t xml:space="preserve">Cuenta con señales informativas </w:t>
+            </w:r>
             <w:r>
               <w:rPr>
                 <w:rFonts w:cstheme="minorHAnsi"/>
                 <w:color w:val="000000" w:themeColor="text1"/>
               </w:rPr>
-              <w:t>{{ salida</w:t>
-            </w:r>
-            <w:proofErr w:type="gramEnd"/>
+              <w:t xml:space="preserve">de que hacer en caso de sismo e incendio </w:t>
+            </w:r>
             <w:r>
               <w:rPr>
                 <w:rFonts w:cstheme="minorHAnsi"/>
                 <w:color w:val="000000" w:themeColor="text1"/>
               </w:rPr>
-              <w:t xml:space="preserve"> }}</w:t>
-            </w:r>
-          </w:p>
-        </w:tc>
-      </w:tr>
-      <w:tr>
-        <w:trPr>
-          <w:trHeight w:val="20"/>
-        </w:trPr>
-        <w:tc>
-          <w:tcPr>
-            <w:tcW w:w="4414" w:type="dxa"/>
-            <w:vAlign w:val="center"/>
-          </w:tcPr>
-          <w:p>
-            <w:pPr>
-              <w:pStyle w:val="Prrafodelista"/>
-              <w:spacing w:after="0" w:line="240" w:lineRule="auto"/>
-              <w:ind w:left="0"/>
-              <w:jc w:val="both"/>
+              <w:t xml:space="preserve">con instrucciones claras sobre procedimientos de seguridad en caso de sismo o incendio, se sugiere </w:t>
+            </w:r>
+            <w:r>
               <w:rPr>
                 <w:rFonts w:cstheme="minorHAnsi"/>
                 <w:color w:val="000000" w:themeColor="text1"/>
-                <w:sz w:val="20"/>
-                <w:szCs w:val="20"/>
-              </w:rPr>
-            </w:pPr>
-          </w:p>
-        </w:tc>
-        <w:tc>
-          <w:tcPr>
-            <w:tcW w:w="4414" w:type="dxa"/>
-            <w:vAlign w:val="center"/>
-          </w:tcPr>
-          <w:p>
-            <w:pPr>
-              <w:pStyle w:val="Prrafodelista"/>
-              <w:spacing w:after="0" w:line="240" w:lineRule="auto"/>
-              <w:ind w:left="0"/>
-              <w:jc w:val="center"/>
+              </w:rPr>
+              <w:t>mantener</w:t>
+            </w:r>
+            <w:r>
               <w:rPr>
                 <w:rFonts w:cstheme="minorHAnsi"/>
                 <w:color w:val="000000" w:themeColor="text1"/>
               </w:rPr>
-            </w:pPr>
+              <w:t xml:space="preserve"> su correcta ubicación.</w:t>
+            </w:r>
           </w:p>
         </w:tc>
       </w:tr>
@@ -1736,14 +1970,27 @@
               <w:pStyle w:val="Prrafodelista"/>
               <w:spacing w:after="0" w:line="360" w:lineRule="auto"/>
               <w:ind w:left="0"/>
-              <w:jc w:val="both"/>
+              <w:jc w:val="center"/>
               <w:rPr>
                 <w:rFonts w:cstheme="minorHAnsi"/>
                 <w:color w:val="000000" w:themeColor="text1"/>
               </w:rPr>
             </w:pPr>
-            <w:r>
-              <w:t>Cuenta con detectores de humo fotoeléctrico de acuerdo con norma y área de riesgo se encuentran vigentes, se recomienda dar seguimiento al programa de mantenimiento anual.</w:t>
+            <w:proofErr w:type="gramStart"/>
+            <w:r>
+              <w:t xml:space="preserve">{{ </w:t>
+            </w:r>
+            <w:proofErr w:type="spellStart"/>
+            <w:r>
+              <w:t>sis</w:t>
+            </w:r>
+            <w:proofErr w:type="gramEnd"/>
+            <w:r>
+              <w:t>_inc</w:t>
+            </w:r>
+            <w:proofErr w:type="spellEnd"/>
+            <w:r>
+              <w:t xml:space="preserve"> }}</w:t>
             </w:r>
           </w:p>
         </w:tc>
@@ -1758,21 +2005,18 @@
               <w:spacing w:after="0" w:line="360" w:lineRule="auto"/>
               <w:ind w:left="0"/>
               <w:jc w:val="center"/>
-              <w:rPr>
-                <w:rFonts w:cstheme="minorHAnsi"/>
-                <w:color w:val="000000" w:themeColor="text1"/>
-              </w:rPr>
             </w:pPr>
             <w:proofErr w:type="gramStart"/>
             <w:r>
-              <w:t xml:space="preserve">{{ </w:t>
-            </w:r>
-            <w:proofErr w:type="spellStart"/>
-            <w:r>
-              <w:t>dh</w:t>
-            </w:r>
-            <w:proofErr w:type="spellEnd"/>
+              <w:t>{{ sis</w:t>
+            </w:r>
             <w:proofErr w:type="gramEnd"/>
+            <w:r>
+              <w:t>_inc</w:t>
+            </w:r>
+            <w:r>
+              <w:t>1</w:t>
+            </w:r>
             <w:r>
               <w:t xml:space="preserve"> }}</w:t>
             </w:r>
@@ -1814,6 +2058,39 @@
                 <w:szCs w:val="20"/>
               </w:rPr>
             </w:pPr>
+          </w:p>
+        </w:tc>
+      </w:tr>
+      <w:tr>
+        <w:trPr>
+          <w:trHeight w:val="1701"/>
+        </w:trPr>
+        <w:tc>
+          <w:tcPr>
+            <w:tcW w:w="8828" w:type="dxa"/>
+            <w:gridSpan w:val="2"/>
+            <w:vAlign w:val="center"/>
+          </w:tcPr>
+          <w:p>
+            <w:pPr>
+              <w:pStyle w:val="Prrafodelista"/>
+              <w:spacing w:after="0" w:line="360" w:lineRule="auto"/>
+              <w:ind w:left="0"/>
+              <w:jc w:val="both"/>
+              <w:rPr>
+                <w:rFonts w:cstheme="minorHAnsi"/>
+                <w:color w:val="000000" w:themeColor="text1"/>
+              </w:rPr>
+            </w:pPr>
+            <w:r>
+              <w:t xml:space="preserve">Cuenta con un área específica identificada </w:t>
+            </w:r>
+            <w:r>
+              <w:t xml:space="preserve">como zona de menor riesgo </w:t>
+            </w:r>
+            <w:r>
+              <w:t>para proporcionar resguardo temporal durante eventos peligrosos como sismos, se recomienda asegurar su visibilidad y accesibilidad conforme a los planes de emergencia establecidos.</w:t>
+            </w:r>
           </w:p>
         </w:tc>
       </w:tr>
@@ -1831,28 +2108,23 @@
               <w:pStyle w:val="Prrafodelista"/>
               <w:spacing w:after="0" w:line="360" w:lineRule="auto"/>
               <w:ind w:left="0"/>
-              <w:jc w:val="both"/>
+              <w:jc w:val="center"/>
             </w:pPr>
-            <w:r>
-              <w:t xml:space="preserve">Cuenta con </w:t>
-            </w:r>
-            <w:r>
-              <w:t>lámparas de emergencia</w:t>
-            </w:r>
-            <w:r>
-              <w:t xml:space="preserve"> de acuerdo con norma y área de riesgo se encuentran vigentes, se </w:t>
-            </w:r>
-            <w:r>
-              <w:t>recomienda</w:t>
-            </w:r>
-            <w:r>
-              <w:t xml:space="preserve"> </w:t>
-            </w:r>
-            <w:r>
-              <w:t>dar seguimiento al</w:t>
-            </w:r>
-            <w:r>
-              <w:t xml:space="preserve"> programa de mantenimiento anual.</w:t>
+            <w:proofErr w:type="gramStart"/>
+            <w:r>
+              <w:t xml:space="preserve">{{ </w:t>
+            </w:r>
+            <w:proofErr w:type="spellStart"/>
+            <w:r>
+              <w:t>zona</w:t>
+            </w:r>
+            <w:proofErr w:type="gramEnd"/>
+            <w:r>
+              <w:t>_sec</w:t>
+            </w:r>
+            <w:proofErr w:type="spellEnd"/>
+            <w:r>
+              <w:t xml:space="preserve"> }}</w:t>
             </w:r>
           </w:p>
         </w:tc>
@@ -1867,27 +2139,281 @@
               <w:spacing w:after="0" w:line="360" w:lineRule="auto"/>
               <w:ind w:left="0"/>
               <w:jc w:val="center"/>
-              <w:rPr>
-                <w:rFonts w:cstheme="minorHAnsi"/>
-                <w:color w:val="000000" w:themeColor="text1"/>
-              </w:rPr>
             </w:pPr>
             <w:proofErr w:type="gramStart"/>
             <w:r>
+              <w:t>{{ zona</w:t>
+            </w:r>
+            <w:proofErr w:type="gramEnd"/>
+            <w:r>
+              <w:t>_sec</w:t>
+            </w:r>
+            <w:r>
+              <w:t>1</w:t>
+            </w:r>
+            <w:r>
+              <w:t xml:space="preserve"> }}</w:t>
+            </w:r>
+          </w:p>
+        </w:tc>
+      </w:tr>
+    </w:tbl>
+    <w:p>
+      <w:pPr>
+        <w:rPr>
+          <w:rFonts w:cstheme="minorHAnsi"/>
+          <w:color w:val="000000" w:themeColor="text1"/>
+        </w:rPr>
+      </w:pPr>
+      <w:r>
+        <w:rPr>
+          <w:rFonts w:cstheme="minorHAnsi"/>
+          <w:color w:val="000000" w:themeColor="text1"/>
+        </w:rPr>
+        <w:br w:type="page"/>
+      </w:r>
+    </w:p>
+    <w:p>
+      <w:pPr>
+        <w:rPr>
+          <w:rFonts w:cstheme="minorHAnsi"/>
+          <w:color w:val="000000" w:themeColor="text1"/>
+        </w:rPr>
+      </w:pPr>
+    </w:p>
+    <w:tbl>
+      <w:tblPr>
+        <w:tblStyle w:val="Tablaconcuadrcula"/>
+        <w:tblW w:w="0" w:type="auto"/>
+        <w:tblBorders>
+          <w:top w:val="none" w:sz="0" w:space="0" w:color="auto"/>
+          <w:left w:val="none" w:sz="0" w:space="0" w:color="auto"/>
+          <w:bottom w:val="none" w:sz="0" w:space="0" w:color="auto"/>
+          <w:right w:val="none" w:sz="0" w:space="0" w:color="auto"/>
+          <w:insideH w:val="none" w:sz="0" w:space="0" w:color="auto"/>
+          <w:insideV w:val="none" w:sz="0" w:space="0" w:color="auto"/>
+        </w:tblBorders>
+        <w:tblLook w:val="04A0" w:firstRow="1" w:lastRow="0" w:firstColumn="1" w:lastColumn="0" w:noHBand="0" w:noVBand="1"/>
+      </w:tblPr>
+      <w:tblGrid>
+        <w:gridCol w:w="4414"/>
+        <w:gridCol w:w="4414"/>
+      </w:tblGrid>
+      <w:tr>
+        <w:trPr>
+          <w:trHeight w:val="1701"/>
+        </w:trPr>
+        <w:tc>
+          <w:tcPr>
+            <w:tcW w:w="8828" w:type="dxa"/>
+            <w:gridSpan w:val="2"/>
+            <w:vAlign w:val="center"/>
+          </w:tcPr>
+          <w:p>
+            <w:pPr>
+              <w:pStyle w:val="Prrafodelista"/>
+              <w:spacing w:after="0" w:line="360" w:lineRule="auto"/>
+              <w:ind w:left="0"/>
+              <w:jc w:val="both"/>
               <w:rPr>
                 <w:rFonts w:cstheme="minorHAnsi"/>
                 <w:color w:val="000000" w:themeColor="text1"/>
               </w:rPr>
+            </w:pPr>
+            <w:r>
+              <w:t>Cuenta con detectores de humo fotoeléctrico de acuerdo con norma y área de riesgo se encuentran vigentes, se recomienda dar seguimiento al programa de mantenimiento anual.</w:t>
+            </w:r>
+          </w:p>
+        </w:tc>
+      </w:tr>
+      <w:tr>
+        <w:trPr>
+          <w:trHeight w:val="3288"/>
+        </w:trPr>
+        <w:tc>
+          <w:tcPr>
+            <w:tcW w:w="4414" w:type="dxa"/>
+            <w:vAlign w:val="center"/>
+          </w:tcPr>
+          <w:p>
+            <w:pPr>
+              <w:pStyle w:val="Prrafodelista"/>
+              <w:spacing w:after="0" w:line="360" w:lineRule="auto"/>
+              <w:ind w:left="0"/>
+              <w:jc w:val="center"/>
+            </w:pPr>
+            <w:proofErr w:type="gramStart"/>
+            <w:r>
               <w:t xml:space="preserve">{{ </w:t>
             </w:r>
-            <w:r>
+            <w:proofErr w:type="spellStart"/>
+            <w:r>
+              <w:t>dh</w:t>
+            </w:r>
+            <w:proofErr w:type="spellEnd"/>
+            <w:proofErr w:type="gramEnd"/>
+            <w:r>
+              <w:t xml:space="preserve"> }}</w:t>
+            </w:r>
+          </w:p>
+        </w:tc>
+        <w:tc>
+          <w:tcPr>
+            <w:tcW w:w="4414" w:type="dxa"/>
+            <w:vAlign w:val="center"/>
+          </w:tcPr>
+          <w:p>
+            <w:pPr>
+              <w:pStyle w:val="Prrafodelista"/>
+              <w:spacing w:after="0" w:line="360" w:lineRule="auto"/>
+              <w:ind w:left="0"/>
+              <w:jc w:val="center"/>
+            </w:pPr>
+            <w:proofErr w:type="gramStart"/>
+            <w:r>
+              <w:t>{{ dh</w:t>
+            </w:r>
+            <w:proofErr w:type="gramEnd"/>
+            <w:r>
+              <w:t>1</w:t>
+            </w:r>
+            <w:r>
+              <w:t xml:space="preserve"> }}</w:t>
+            </w:r>
+          </w:p>
+        </w:tc>
+      </w:tr>
+      <w:tr>
+        <w:tc>
+          <w:tcPr>
+            <w:tcW w:w="4414" w:type="dxa"/>
+            <w:vAlign w:val="center"/>
+          </w:tcPr>
+          <w:p>
+            <w:pPr>
+              <w:pStyle w:val="Prrafodelista"/>
+              <w:spacing w:after="0" w:line="240" w:lineRule="auto"/>
+              <w:ind w:left="0"/>
+              <w:jc w:val="both"/>
+              <w:rPr>
+                <w:sz w:val="20"/>
+                <w:szCs w:val="20"/>
+              </w:rPr>
+            </w:pPr>
+          </w:p>
+        </w:tc>
+        <w:tc>
+          <w:tcPr>
+            <w:tcW w:w="4414" w:type="dxa"/>
+            <w:vAlign w:val="center"/>
+          </w:tcPr>
+          <w:p>
+            <w:pPr>
+              <w:pStyle w:val="Prrafodelista"/>
+              <w:spacing w:after="0" w:line="240" w:lineRule="auto"/>
+              <w:ind w:left="0"/>
+              <w:jc w:val="center"/>
+              <w:rPr>
+                <w:sz w:val="20"/>
+                <w:szCs w:val="20"/>
+              </w:rPr>
+            </w:pPr>
+          </w:p>
+        </w:tc>
+      </w:tr>
+      <w:tr>
+        <w:trPr>
+          <w:trHeight w:val="1701"/>
+        </w:trPr>
+        <w:tc>
+          <w:tcPr>
+            <w:tcW w:w="8828" w:type="dxa"/>
+            <w:gridSpan w:val="2"/>
+            <w:vAlign w:val="center"/>
+          </w:tcPr>
+          <w:p>
+            <w:pPr>
+              <w:pStyle w:val="Prrafodelista"/>
+              <w:spacing w:after="0" w:line="360" w:lineRule="auto"/>
+              <w:ind w:left="0"/>
+              <w:jc w:val="both"/>
               <w:rPr>
                 <w:rFonts w:cstheme="minorHAnsi"/>
                 <w:color w:val="000000" w:themeColor="text1"/>
               </w:rPr>
-              <w:t>lampara</w:t>
+            </w:pPr>
+            <w:r>
+              <w:t>Cuenta con lámparas de emergencia de acuerdo con norma y área de riesgo se encuentran vigentes, se recomienda dar seguimiento al programa de mantenimiento anual.</w:t>
+            </w:r>
+          </w:p>
+        </w:tc>
+      </w:tr>
+      <w:tr>
+        <w:trPr>
+          <w:trHeight w:val="3288"/>
+        </w:trPr>
+        <w:tc>
+          <w:tcPr>
+            <w:tcW w:w="4414" w:type="dxa"/>
+            <w:vAlign w:val="center"/>
+          </w:tcPr>
+          <w:p>
+            <w:pPr>
+              <w:pStyle w:val="Prrafodelista"/>
+              <w:spacing w:after="0" w:line="360" w:lineRule="auto"/>
+              <w:ind w:left="0"/>
+              <w:jc w:val="center"/>
+            </w:pPr>
+            <w:proofErr w:type="gramStart"/>
+            <w:r>
+              <w:rPr>
+                <w:rFonts w:cstheme="minorHAnsi"/>
+                <w:color w:val="000000" w:themeColor="text1"/>
+              </w:rPr>
+              <w:t>{{ lampara</w:t>
             </w:r>
             <w:proofErr w:type="gramEnd"/>
+            <w:r>
+              <w:rPr>
+                <w:rFonts w:cstheme="minorHAnsi"/>
+                <w:color w:val="000000" w:themeColor="text1"/>
+              </w:rPr>
+              <w:t xml:space="preserve"> }}</w:t>
+            </w:r>
+          </w:p>
+        </w:tc>
+        <w:tc>
+          <w:tcPr>
+            <w:tcW w:w="4414" w:type="dxa"/>
+            <w:vAlign w:val="center"/>
+          </w:tcPr>
+          <w:p>
+            <w:pPr>
+              <w:pStyle w:val="Prrafodelista"/>
+              <w:spacing w:after="0" w:line="360" w:lineRule="auto"/>
+              <w:ind w:left="0"/>
+              <w:jc w:val="center"/>
+              <w:rPr>
+                <w:rFonts w:cstheme="minorHAnsi"/>
+                <w:color w:val="000000" w:themeColor="text1"/>
+              </w:rPr>
+            </w:pPr>
+            <w:proofErr w:type="gramStart"/>
+            <w:r>
+              <w:rPr>
+                <w:rFonts w:cstheme="minorHAnsi"/>
+                <w:color w:val="000000" w:themeColor="text1"/>
+              </w:rPr>
+              <w:t>{{ lampara</w:t>
+            </w:r>
+            <w:proofErr w:type="gramEnd"/>
+            <w:r>
+              <w:rPr>
+                <w:rFonts w:cstheme="minorHAnsi"/>
+                <w:color w:val="000000" w:themeColor="text1"/>
+              </w:rPr>
+              <w:t>1</w:t>
+            </w:r>
             <w:r>
               <w:rPr>
                 <w:rFonts w:cstheme="minorHAnsi"/>
@@ -2290,6 +2816,16 @@
         </w:tc>
       </w:tr>
       <w:tr>
+        <w:tblPrEx>
+          <w:tblBorders>
+            <w:top w:val="single" w:sz="4" w:space="0" w:color="auto"/>
+            <w:left w:val="single" w:sz="4" w:space="0" w:color="auto"/>
+            <w:bottom w:val="single" w:sz="4" w:space="0" w:color="auto"/>
+            <w:right w:val="single" w:sz="4" w:space="0" w:color="auto"/>
+            <w:insideH w:val="single" w:sz="4" w:space="0" w:color="auto"/>
+            <w:insideV w:val="single" w:sz="4" w:space="0" w:color="auto"/>
+          </w:tblBorders>
+        </w:tblPrEx>
         <w:trPr>
           <w:trHeight w:val="3288"/>
         </w:trPr>
@@ -2297,47 +2833,31 @@
           <w:tcPr>
             <w:tcW w:w="4536" w:type="dxa"/>
             <w:gridSpan w:val="2"/>
+            <w:tcBorders>
+              <w:top w:val="nil"/>
+              <w:left w:val="nil"/>
+              <w:bottom w:val="nil"/>
+              <w:right w:val="nil"/>
+            </w:tcBorders>
             <w:vAlign w:val="center"/>
           </w:tcPr>
           <w:p>
             <w:pPr>
-              <w:pStyle w:val="Default"/>
-              <w:spacing w:line="360" w:lineRule="auto"/>
-              <w:ind w:right="-60"/>
-              <w:rPr>
-                <w:rFonts w:asciiTheme="minorHAnsi" w:hAnsiTheme="minorHAnsi" w:cstheme="minorHAnsi"/>
-                <w:color w:val="000000" w:themeColor="text1"/>
-                <w:sz w:val="22"/>
-                <w:szCs w:val="22"/>
+              <w:pStyle w:val="Prrafodelista"/>
+              <w:spacing w:after="0" w:line="360" w:lineRule="auto"/>
+              <w:ind w:left="0"/>
+              <w:jc w:val="both"/>
+              <w:rPr>
+                <w:rFonts w:cstheme="minorHAnsi"/>
+                <w:color w:val="000000" w:themeColor="text1"/>
               </w:rPr>
             </w:pPr>
             <w:r>
               <w:rPr>
-                <w:rFonts w:asciiTheme="minorHAnsi" w:hAnsiTheme="minorHAnsi" w:cstheme="minorHAnsi"/>
-                <w:color w:val="000000" w:themeColor="text1"/>
-                <w:sz w:val="22"/>
-                <w:szCs w:val="22"/>
-              </w:rPr>
-              <w:t>Instalación eléctrica maneja voltaje de 110 volts, se encuentran dentro de canaleta, no presenta cableado provisional,</w:t>
-            </w:r>
-            <w:r>
-              <w:rPr>
-                <w:rFonts w:asciiTheme="minorHAnsi" w:hAnsiTheme="minorHAnsi" w:cstheme="minorHAnsi"/>
-                <w:noProof/>
-                <w:color w:val="000000" w:themeColor="text1"/>
-                <w:sz w:val="22"/>
-                <w:szCs w:val="22"/>
-              </w:rPr>
-              <w:t xml:space="preserve"> </w:t>
-            </w:r>
-            <w:r>
-              <w:rPr>
-                <w:rFonts w:asciiTheme="minorHAnsi" w:hAnsiTheme="minorHAnsi" w:cstheme="minorHAnsi"/>
-                <w:color w:val="000000" w:themeColor="text1"/>
-                <w:sz w:val="22"/>
-                <w:szCs w:val="22"/>
-              </w:rPr>
-              <w:t xml:space="preserve">mismo que se realiza evitando riesgos.  </w:t>
+                <w:rFonts w:cstheme="minorHAnsi"/>
+                <w:color w:val="000000" w:themeColor="text1"/>
+              </w:rPr>
+              <w:t>La estantería se encuentra bien empotrada con material colocado de acuerdo con peso, con bordes romos sin riesgo para los usuarios.</w:t>
             </w:r>
           </w:p>
         </w:tc>
@@ -2345,48 +2865,38 @@
           <w:tcPr>
             <w:tcW w:w="4297" w:type="dxa"/>
             <w:gridSpan w:val="2"/>
+            <w:tcBorders>
+              <w:top w:val="nil"/>
+              <w:left w:val="nil"/>
+              <w:bottom w:val="nil"/>
+              <w:right w:val="nil"/>
+            </w:tcBorders>
             <w:vAlign w:val="center"/>
           </w:tcPr>
           <w:p>
             <w:pPr>
-              <w:pStyle w:val="Default"/>
-              <w:spacing w:line="360" w:lineRule="auto"/>
+              <w:pStyle w:val="Prrafodelista"/>
+              <w:spacing w:after="0" w:line="360" w:lineRule="auto"/>
+              <w:ind w:left="0"/>
               <w:jc w:val="center"/>
               <w:rPr>
-                <w:rFonts w:asciiTheme="minorHAnsi" w:hAnsiTheme="minorHAnsi" w:cstheme="minorHAnsi"/>
-                <w:color w:val="000000" w:themeColor="text1"/>
-                <w:sz w:val="22"/>
-                <w:szCs w:val="22"/>
+                <w:rFonts w:cstheme="minorHAnsi"/>
+                <w:color w:val="000000" w:themeColor="text1"/>
               </w:rPr>
             </w:pPr>
             <w:proofErr w:type="gramStart"/>
             <w:r>
               <w:rPr>
-                <w:rFonts w:asciiTheme="minorHAnsi" w:hAnsiTheme="minorHAnsi" w:cstheme="minorHAnsi"/>
-                <w:color w:val="000000" w:themeColor="text1"/>
-                <w:sz w:val="22"/>
-                <w:szCs w:val="22"/>
-              </w:rPr>
-              <w:t xml:space="preserve">{{ </w:t>
-            </w:r>
-            <w:proofErr w:type="spellStart"/>
-            <w:r>
-              <w:rPr>
-                <w:rFonts w:asciiTheme="minorHAnsi" w:hAnsiTheme="minorHAnsi" w:cstheme="minorHAnsi"/>
-                <w:color w:val="000000" w:themeColor="text1"/>
-                <w:sz w:val="22"/>
-                <w:szCs w:val="22"/>
-              </w:rPr>
-              <w:t>electrico</w:t>
-            </w:r>
-            <w:proofErr w:type="spellEnd"/>
+                <w:rFonts w:cstheme="minorHAnsi"/>
+                <w:color w:val="000000" w:themeColor="text1"/>
+              </w:rPr>
+              <w:t>{{ estantes</w:t>
+            </w:r>
             <w:proofErr w:type="gramEnd"/>
             <w:r>
               <w:rPr>
-                <w:rFonts w:asciiTheme="minorHAnsi" w:hAnsiTheme="minorHAnsi" w:cstheme="minorHAnsi"/>
-                <w:color w:val="000000" w:themeColor="text1"/>
-                <w:sz w:val="22"/>
-                <w:szCs w:val="22"/>
+                <w:rFonts w:cstheme="minorHAnsi"/>
+                <w:color w:val="000000" w:themeColor="text1"/>
               </w:rPr>
               <w:t xml:space="preserve"> }}</w:t>
             </w:r>
@@ -2394,22 +2904,35 @@
         </w:tc>
       </w:tr>
       <w:tr>
-        <w:trPr>
-          <w:trHeight w:val="20"/>
-        </w:trPr>
+        <w:tblPrEx>
+          <w:tblBorders>
+            <w:top w:val="single" w:sz="4" w:space="0" w:color="auto"/>
+            <w:left w:val="single" w:sz="4" w:space="0" w:color="auto"/>
+            <w:bottom w:val="single" w:sz="4" w:space="0" w:color="auto"/>
+            <w:right w:val="single" w:sz="4" w:space="0" w:color="auto"/>
+            <w:insideH w:val="single" w:sz="4" w:space="0" w:color="auto"/>
+            <w:insideV w:val="single" w:sz="4" w:space="0" w:color="auto"/>
+          </w:tblBorders>
+        </w:tblPrEx>
         <w:tc>
           <w:tcPr>
             <w:tcW w:w="4536" w:type="dxa"/>
             <w:gridSpan w:val="2"/>
+            <w:tcBorders>
+              <w:top w:val="nil"/>
+              <w:left w:val="nil"/>
+              <w:bottom w:val="nil"/>
+              <w:right w:val="nil"/>
+            </w:tcBorders>
             <w:vAlign w:val="center"/>
           </w:tcPr>
           <w:p>
             <w:pPr>
-              <w:pStyle w:val="Default"/>
-              <w:ind w:right="-60"/>
-              <w:rPr>
-                <w:rFonts w:asciiTheme="minorHAnsi" w:hAnsiTheme="minorHAnsi" w:cstheme="minorHAnsi"/>
-                <w:color w:val="000000" w:themeColor="text1"/>
+              <w:pStyle w:val="Prrafodelista"/>
+              <w:spacing w:after="0" w:line="240" w:lineRule="auto"/>
+              <w:ind w:left="0"/>
+              <w:jc w:val="both"/>
+              <w:rPr>
                 <w:sz w:val="20"/>
                 <w:szCs w:val="20"/>
               </w:rPr>
@@ -2420,15 +2943,21 @@
           <w:tcPr>
             <w:tcW w:w="4297" w:type="dxa"/>
             <w:gridSpan w:val="2"/>
+            <w:tcBorders>
+              <w:top w:val="nil"/>
+              <w:left w:val="nil"/>
+              <w:bottom w:val="nil"/>
+              <w:right w:val="nil"/>
+            </w:tcBorders>
             <w:vAlign w:val="center"/>
           </w:tcPr>
           <w:p>
             <w:pPr>
-              <w:pStyle w:val="Default"/>
-              <w:ind w:right="-60"/>
-              <w:rPr>
-                <w:rFonts w:asciiTheme="minorHAnsi" w:hAnsiTheme="minorHAnsi" w:cstheme="minorHAnsi"/>
-                <w:color w:val="000000" w:themeColor="text1"/>
+              <w:pStyle w:val="Prrafodelista"/>
+              <w:spacing w:after="0" w:line="240" w:lineRule="auto"/>
+              <w:ind w:left="0"/>
+              <w:jc w:val="center"/>
+              <w:rPr>
                 <w:sz w:val="20"/>
                 <w:szCs w:val="20"/>
               </w:rPr>
@@ -2437,6 +2966,16 @@
         </w:tc>
       </w:tr>
       <w:tr>
+        <w:tblPrEx>
+          <w:tblBorders>
+            <w:top w:val="single" w:sz="4" w:space="0" w:color="auto"/>
+            <w:left w:val="single" w:sz="4" w:space="0" w:color="auto"/>
+            <w:bottom w:val="single" w:sz="4" w:space="0" w:color="auto"/>
+            <w:right w:val="single" w:sz="4" w:space="0" w:color="auto"/>
+            <w:insideH w:val="single" w:sz="4" w:space="0" w:color="auto"/>
+            <w:insideV w:val="single" w:sz="4" w:space="0" w:color="auto"/>
+          </w:tblBorders>
+        </w:tblPrEx>
         <w:trPr>
           <w:trHeight w:val="3288"/>
         </w:trPr>
@@ -2444,29 +2983,43 @@
           <w:tcPr>
             <w:tcW w:w="4536" w:type="dxa"/>
             <w:gridSpan w:val="2"/>
+            <w:tcBorders>
+              <w:top w:val="nil"/>
+              <w:left w:val="nil"/>
+              <w:bottom w:val="nil"/>
+              <w:right w:val="nil"/>
+            </w:tcBorders>
             <w:vAlign w:val="center"/>
           </w:tcPr>
           <w:p>
             <w:pPr>
-              <w:pStyle w:val="Default"/>
-              <w:spacing w:line="360" w:lineRule="auto"/>
-              <w:ind w:right="-60"/>
+              <w:pStyle w:val="Prrafodelista"/>
+              <w:spacing w:after="0" w:line="360" w:lineRule="auto"/>
+              <w:ind w:left="0"/>
               <w:jc w:val="both"/>
-              <w:rPr>
-                <w:rFonts w:asciiTheme="minorHAnsi" w:hAnsiTheme="minorHAnsi" w:cstheme="minorHAnsi"/>
-                <w:color w:val="000000" w:themeColor="text1"/>
-                <w:sz w:val="22"/>
-                <w:szCs w:val="22"/>
-              </w:rPr>
             </w:pPr>
             <w:r>
               <w:rPr>
-                <w:rFonts w:asciiTheme="minorHAnsi" w:hAnsiTheme="minorHAnsi" w:cstheme="minorHAnsi"/>
-                <w:color w:val="000000" w:themeColor="text1"/>
-                <w:sz w:val="22"/>
-                <w:szCs w:val="22"/>
-              </w:rPr>
-              <w:t>Los sanitarios se encuentran higiénicos y sanitizados, con medidas acorde a la población usuarios. Evitar el transvase en productos de limpieza y preferentemente utilizar sustancias con las mismas propiedades químicas, pero menos peligrosas para la salud durante su aseo.</w:t>
+                <w:rFonts w:cstheme="minorHAnsi"/>
+                <w:color w:val="000000" w:themeColor="text1"/>
+              </w:rPr>
+              <w:t xml:space="preserve">El site se encuentra restringido en su acceso, limpio de almacenaje de combustibles sólidos y otros, con detector de humo vigente, toda la instalación eléctrica bajo resguardo tubo </w:t>
+            </w:r>
+            <w:proofErr w:type="spellStart"/>
+            <w:r>
+              <w:rPr>
+                <w:rFonts w:cstheme="minorHAnsi"/>
+                <w:color w:val="000000" w:themeColor="text1"/>
+              </w:rPr>
+              <w:t>conduit</w:t>
+            </w:r>
+            <w:proofErr w:type="spellEnd"/>
+            <w:r>
+              <w:rPr>
+                <w:rFonts w:cstheme="minorHAnsi"/>
+                <w:color w:val="000000" w:themeColor="text1"/>
+              </w:rPr>
+              <w:t>, señalizado en sus tableros de control, con sistema de ventilación adecuado.</w:t>
             </w:r>
           </w:p>
         </w:tc>
@@ -2474,48 +3027,38 @@
           <w:tcPr>
             <w:tcW w:w="4297" w:type="dxa"/>
             <w:gridSpan w:val="2"/>
+            <w:tcBorders>
+              <w:top w:val="nil"/>
+              <w:left w:val="nil"/>
+              <w:bottom w:val="nil"/>
+              <w:right w:val="nil"/>
+            </w:tcBorders>
             <w:vAlign w:val="center"/>
           </w:tcPr>
           <w:p>
             <w:pPr>
-              <w:pStyle w:val="Default"/>
-              <w:spacing w:line="360" w:lineRule="auto"/>
+              <w:pStyle w:val="Prrafodelista"/>
+              <w:spacing w:after="0" w:line="360" w:lineRule="auto"/>
+              <w:ind w:left="0"/>
               <w:jc w:val="center"/>
               <w:rPr>
-                <w:rFonts w:asciiTheme="minorHAnsi" w:hAnsiTheme="minorHAnsi" w:cstheme="minorHAnsi"/>
-                <w:color w:val="000000" w:themeColor="text1"/>
-                <w:sz w:val="22"/>
-                <w:szCs w:val="22"/>
+                <w:rFonts w:cstheme="minorHAnsi"/>
+                <w:color w:val="000000" w:themeColor="text1"/>
               </w:rPr>
             </w:pPr>
             <w:proofErr w:type="gramStart"/>
             <w:r>
               <w:rPr>
-                <w:rFonts w:asciiTheme="minorHAnsi" w:hAnsiTheme="minorHAnsi" w:cstheme="minorHAnsi"/>
-                <w:color w:val="000000" w:themeColor="text1"/>
-                <w:sz w:val="22"/>
-                <w:szCs w:val="22"/>
-              </w:rPr>
-              <w:t xml:space="preserve">{{ </w:t>
-            </w:r>
-            <w:proofErr w:type="spellStart"/>
-            <w:r>
-              <w:rPr>
-                <w:rFonts w:asciiTheme="minorHAnsi" w:hAnsiTheme="minorHAnsi" w:cstheme="minorHAnsi"/>
-                <w:color w:val="000000" w:themeColor="text1"/>
-                <w:sz w:val="22"/>
-                <w:szCs w:val="22"/>
-              </w:rPr>
-              <w:t>banio</w:t>
-            </w:r>
-            <w:proofErr w:type="spellEnd"/>
+                <w:rFonts w:cstheme="minorHAnsi"/>
+                <w:color w:val="000000" w:themeColor="text1"/>
+              </w:rPr>
+              <w:t>{{ site</w:t>
+            </w:r>
             <w:proofErr w:type="gramEnd"/>
             <w:r>
               <w:rPr>
-                <w:rFonts w:asciiTheme="minorHAnsi" w:hAnsiTheme="minorHAnsi" w:cstheme="minorHAnsi"/>
-                <w:color w:val="000000" w:themeColor="text1"/>
-                <w:sz w:val="22"/>
-                <w:szCs w:val="22"/>
+                <w:rFonts w:cstheme="minorHAnsi"/>
+                <w:color w:val="000000" w:themeColor="text1"/>
               </w:rPr>
               <w:t xml:space="preserve"> }}</w:t>
             </w:r>
@@ -2567,6 +3110,51 @@
       </w:tblGrid>
       <w:tr>
         <w:trPr>
+          <w:trHeight w:val="1701"/>
+        </w:trPr>
+        <w:tc>
+          <w:tcPr>
+            <w:tcW w:w="8828" w:type="dxa"/>
+            <w:gridSpan w:val="2"/>
+            <w:vAlign w:val="center"/>
+          </w:tcPr>
+          <w:p>
+            <w:pPr>
+              <w:pStyle w:val="Default"/>
+              <w:spacing w:line="360" w:lineRule="auto"/>
+              <w:jc w:val="both"/>
+              <w:rPr>
+                <w:rFonts w:asciiTheme="minorHAnsi" w:hAnsiTheme="minorHAnsi" w:cstheme="minorHAnsi"/>
+                <w:color w:val="000000" w:themeColor="text1"/>
+                <w:sz w:val="22"/>
+                <w:szCs w:val="22"/>
+              </w:rPr>
+            </w:pPr>
+            <w:r>
+              <w:rPr>
+                <w:rFonts w:asciiTheme="minorHAnsi" w:hAnsiTheme="minorHAnsi" w:cstheme="minorHAnsi"/>
+                <w:color w:val="000000" w:themeColor="text1"/>
+                <w:sz w:val="22"/>
+                <w:szCs w:val="22"/>
+              </w:rPr>
+              <w:t>Cuenta con mantenimiento a techo, lozas y azotea debe registrarse en bitácora, dando evidencia de limpieza en bajadas pluviales, aplicación de impermeabilizante, mantenimiento preventivo y correctivo</w:t>
+            </w:r>
+            <w:r>
+              <w:rPr>
+                <w:rFonts w:asciiTheme="minorHAnsi" w:hAnsiTheme="minorHAnsi" w:cstheme="minorHAnsi"/>
+                <w:noProof/>
+                <w:color w:val="000000" w:themeColor="text1"/>
+                <w:sz w:val="22"/>
+                <w:szCs w:val="22"/>
+                <w:lang w:eastAsia="es-MX"/>
+              </w:rPr>
+              <w:t>.  En techo cuenta con iluminación tipo LED y ahorradores de energía.</w:t>
+            </w:r>
+          </w:p>
+        </w:tc>
+      </w:tr>
+      <w:tr>
+        <w:trPr>
           <w:trHeight w:val="3288"/>
         </w:trPr>
         <w:tc>
@@ -2578,7 +3166,7 @@
             <w:pPr>
               <w:pStyle w:val="Default"/>
               <w:spacing w:line="360" w:lineRule="auto"/>
-              <w:jc w:val="both"/>
+              <w:jc w:val="center"/>
               <w:rPr>
                 <w:rFonts w:asciiTheme="minorHAnsi" w:hAnsiTheme="minorHAnsi" w:cstheme="minorHAnsi"/>
                 <w:color w:val="000000" w:themeColor="text1"/>
@@ -2586,6 +3174,7 @@
                 <w:szCs w:val="22"/>
               </w:rPr>
             </w:pPr>
+            <w:proofErr w:type="gramStart"/>
             <w:r>
               <w:rPr>
                 <w:rFonts w:asciiTheme="minorHAnsi" w:hAnsiTheme="minorHAnsi" w:cstheme="minorHAnsi"/>
@@ -2593,18 +3182,17 @@
                 <w:sz w:val="22"/>
                 <w:szCs w:val="22"/>
               </w:rPr>
-              <w:t>Cuenta con mantenimiento a techo, lozas y azotea debe registrarse en bitácora, dando evidencia de limpieza en bajadas pluviales, aplicación de impermeabilizante, mantenimiento preventivo y correctivo</w:t>
-            </w:r>
+              <w:t>{{ techo</w:t>
+            </w:r>
+            <w:proofErr w:type="gramEnd"/>
             <w:r>
               <w:rPr>
                 <w:rFonts w:asciiTheme="minorHAnsi" w:hAnsiTheme="minorHAnsi" w:cstheme="minorHAnsi"/>
-                <w:noProof/>
                 <w:color w:val="000000" w:themeColor="text1"/>
                 <w:sz w:val="22"/>
                 <w:szCs w:val="22"/>
-                <w:lang w:eastAsia="es-MX"/>
-              </w:rPr>
-              <w:t>.  En techo cuenta con iluminación tipo LED y ahorradores de energía.</w:t>
+              </w:rPr>
+              <w:t xml:space="preserve"> }}</w:t>
             </w:r>
           </w:p>
         </w:tc>
@@ -2636,6 +3224,15 @@
               <w:t>{{ techo</w:t>
             </w:r>
             <w:proofErr w:type="gramEnd"/>
+            <w:r>
+              <w:rPr>
+                <w:rFonts w:asciiTheme="minorHAnsi" w:hAnsiTheme="minorHAnsi" w:cstheme="minorHAnsi"/>
+                <w:color w:val="000000" w:themeColor="text1"/>
+                <w:sz w:val="22"/>
+                <w:szCs w:val="22"/>
+              </w:rPr>
+              <w:t>1</w:t>
+            </w:r>
             <w:r>
               <w:rPr>
                 <w:rFonts w:asciiTheme="minorHAnsi" w:hAnsiTheme="minorHAnsi" w:cstheme="minorHAnsi"/>
@@ -2691,11 +3288,12 @@
       </w:tr>
       <w:tr>
         <w:trPr>
-          <w:trHeight w:val="3288"/>
+          <w:trHeight w:val="1701"/>
         </w:trPr>
         <w:tc>
           <w:tcPr>
-            <w:tcW w:w="4414" w:type="dxa"/>
+            <w:tcW w:w="8828" w:type="dxa"/>
+            <w:gridSpan w:val="2"/>
             <w:vAlign w:val="center"/>
           </w:tcPr>
           <w:p>
@@ -2719,86 +3317,6 @@
               </w:rPr>
               <w:t>Los pisos deben mantenerse limpios y libres de obstáculos permanentemente, evitar malas condiciones pudiendo propiciar un accidente como caídas, resbalones, golpes que amenace a los trabajadores o los usuarios y usuarios según la NOM 001 STPS 2008.</w:t>
             </w:r>
-          </w:p>
-        </w:tc>
-        <w:tc>
-          <w:tcPr>
-            <w:tcW w:w="4414" w:type="dxa"/>
-            <w:vAlign w:val="center"/>
-          </w:tcPr>
-          <w:p>
-            <w:pPr>
-              <w:pStyle w:val="Default"/>
-              <w:spacing w:line="360" w:lineRule="auto"/>
-              <w:jc w:val="center"/>
-              <w:rPr>
-                <w:rFonts w:asciiTheme="minorHAnsi" w:hAnsiTheme="minorHAnsi" w:cstheme="minorHAnsi"/>
-                <w:color w:val="000000" w:themeColor="text1"/>
-                <w:sz w:val="22"/>
-                <w:szCs w:val="22"/>
-              </w:rPr>
-            </w:pPr>
-            <w:proofErr w:type="gramStart"/>
-            <w:r>
-              <w:rPr>
-                <w:rFonts w:asciiTheme="minorHAnsi" w:hAnsiTheme="minorHAnsi" w:cstheme="minorHAnsi"/>
-                <w:color w:val="000000" w:themeColor="text1"/>
-                <w:sz w:val="22"/>
-                <w:szCs w:val="22"/>
-              </w:rPr>
-              <w:t>{{ pisos</w:t>
-            </w:r>
-            <w:proofErr w:type="gramEnd"/>
-            <w:r>
-              <w:rPr>
-                <w:rFonts w:asciiTheme="minorHAnsi" w:hAnsiTheme="minorHAnsi" w:cstheme="minorHAnsi"/>
-                <w:color w:val="000000" w:themeColor="text1"/>
-                <w:sz w:val="22"/>
-                <w:szCs w:val="22"/>
-              </w:rPr>
-              <w:t xml:space="preserve"> }}</w:t>
-            </w:r>
-          </w:p>
-        </w:tc>
-      </w:tr>
-      <w:tr>
-        <w:trPr>
-          <w:trHeight w:val="272"/>
-        </w:trPr>
-        <w:tc>
-          <w:tcPr>
-            <w:tcW w:w="4414" w:type="dxa"/>
-            <w:vAlign w:val="center"/>
-          </w:tcPr>
-          <w:p>
-            <w:pPr>
-              <w:pStyle w:val="Default"/>
-              <w:jc w:val="both"/>
-              <w:rPr>
-                <w:rFonts w:asciiTheme="minorHAnsi" w:hAnsiTheme="minorHAnsi" w:cstheme="minorHAnsi"/>
-                <w:color w:val="000000" w:themeColor="text1"/>
-                <w:sz w:val="20"/>
-                <w:szCs w:val="20"/>
-              </w:rPr>
-            </w:pPr>
-          </w:p>
-        </w:tc>
-        <w:tc>
-          <w:tcPr>
-            <w:tcW w:w="4414" w:type="dxa"/>
-            <w:vAlign w:val="center"/>
-          </w:tcPr>
-          <w:p>
-            <w:pPr>
-              <w:pStyle w:val="Default"/>
-              <w:jc w:val="center"/>
-              <w:rPr>
-                <w:rFonts w:asciiTheme="minorHAnsi" w:hAnsiTheme="minorHAnsi" w:cstheme="minorHAnsi"/>
-                <w:color w:val="000000" w:themeColor="text1"/>
-                <w:sz w:val="20"/>
-                <w:szCs w:val="20"/>
-              </w:rPr>
-            </w:pPr>
           </w:p>
         </w:tc>
       </w:tr>
@@ -2815,7 +3333,7 @@
             <w:pPr>
               <w:pStyle w:val="Default"/>
               <w:spacing w:line="360" w:lineRule="auto"/>
-              <w:jc w:val="both"/>
+              <w:jc w:val="center"/>
               <w:rPr>
                 <w:rFonts w:asciiTheme="minorHAnsi" w:hAnsiTheme="minorHAnsi" w:cstheme="minorHAnsi"/>
                 <w:color w:val="000000" w:themeColor="text1"/>
@@ -2823,6 +3341,7 @@
                 <w:szCs w:val="22"/>
               </w:rPr>
             </w:pPr>
+            <w:proofErr w:type="gramStart"/>
             <w:r>
               <w:rPr>
                 <w:rFonts w:asciiTheme="minorHAnsi" w:hAnsiTheme="minorHAnsi" w:cstheme="minorHAnsi"/>
@@ -2830,7 +3349,17 @@
                 <w:sz w:val="22"/>
                 <w:szCs w:val="22"/>
               </w:rPr>
-              <w:t>La resistencia al fuego de los materiales constitutivos de estructura constructiva del inmueble, cumplen con lo requerida en las normas vigentes, NOM 002 STPS 2010.</w:t>
+              <w:t>{{ pisos</w:t>
+            </w:r>
+            <w:proofErr w:type="gramEnd"/>
+            <w:r>
+              <w:rPr>
+                <w:rFonts w:asciiTheme="minorHAnsi" w:hAnsiTheme="minorHAnsi" w:cstheme="minorHAnsi"/>
+                <w:color w:val="000000" w:themeColor="text1"/>
+                <w:sz w:val="22"/>
+                <w:szCs w:val="22"/>
+              </w:rPr>
+              <w:t xml:space="preserve"> }}</w:t>
             </w:r>
           </w:p>
         </w:tc>
@@ -2859,7 +3388,7 @@
                 <w:sz w:val="22"/>
                 <w:szCs w:val="22"/>
               </w:rPr>
-              <w:t>{{ mueble</w:t>
+              <w:t>{{ pisos</w:t>
             </w:r>
             <w:proofErr w:type="gramEnd"/>
             <w:r>
@@ -2869,49 +3398,17 @@
                 <w:sz w:val="22"/>
                 <w:szCs w:val="22"/>
               </w:rPr>
-              <w:t>1 }}</w:t>
-            </w:r>
-          </w:p>
-        </w:tc>
-      </w:tr>
-      <w:tr>
-        <w:trPr>
-          <w:trHeight w:val="57"/>
-        </w:trPr>
-        <w:tc>
-          <w:tcPr>
-            <w:tcW w:w="4414" w:type="dxa"/>
-            <w:vAlign w:val="center"/>
-          </w:tcPr>
-          <w:p>
-            <w:pPr>
-              <w:pStyle w:val="Default"/>
-              <w:jc w:val="both"/>
+              <w:t>1</w:t>
+            </w:r>
+            <w:r>
               <w:rPr>
                 <w:rFonts w:asciiTheme="minorHAnsi" w:hAnsiTheme="minorHAnsi" w:cstheme="minorHAnsi"/>
                 <w:color w:val="000000" w:themeColor="text1"/>
-                <w:sz w:val="20"/>
-                <w:szCs w:val="20"/>
-              </w:rPr>
-            </w:pPr>
-          </w:p>
-        </w:tc>
-        <w:tc>
-          <w:tcPr>
-            <w:tcW w:w="4414" w:type="dxa"/>
-            <w:vAlign w:val="center"/>
-          </w:tcPr>
-          <w:p>
-            <w:pPr>
-              <w:pStyle w:val="Default"/>
-              <w:jc w:val="center"/>
-              <w:rPr>
-                <w:rFonts w:asciiTheme="minorHAnsi" w:hAnsiTheme="minorHAnsi" w:cstheme="minorHAnsi"/>
-                <w:color w:val="000000" w:themeColor="text1"/>
-                <w:sz w:val="20"/>
-                <w:szCs w:val="20"/>
-              </w:rPr>
-            </w:pPr>
+                <w:sz w:val="22"/>
+                <w:szCs w:val="22"/>
+              </w:rPr>
+              <w:t xml:space="preserve"> }}</w:t>
+            </w:r>
           </w:p>
         </w:tc>
       </w:tr>
@@ -2936,8 +3433,6 @@
         <w:rPr>
           <w:rFonts w:cstheme="minorHAnsi"/>
           <w:color w:val="000000" w:themeColor="text1"/>
-          <w:kern w:val="0"/>
-          <w14:ligatures w14:val="none"/>
         </w:rPr>
       </w:pPr>
     </w:p>
@@ -2945,6 +3440,7 @@
       <w:tblPr>
         <w:tblStyle w:val="Tablaconcuadrcula"/>
         <w:tblW w:w="0" w:type="auto"/>
+        <w:tblInd w:w="-5" w:type="dxa"/>
         <w:tblBorders>
           <w:top w:val="none" w:sz="0" w:space="0" w:color="auto"/>
           <w:left w:val="none" w:sz="0" w:space="0" w:color="auto"/>
@@ -2961,124 +3457,35 @@
       </w:tblGrid>
       <w:tr>
         <w:trPr>
-          <w:trHeight w:val="3288"/>
+          <w:trHeight w:val="1701"/>
         </w:trPr>
         <w:tc>
           <w:tcPr>
-            <w:tcW w:w="4414" w:type="dxa"/>
+            <w:tcW w:w="8828" w:type="dxa"/>
+            <w:gridSpan w:val="2"/>
             <w:vAlign w:val="center"/>
           </w:tcPr>
           <w:p>
             <w:pPr>
-              <w:pStyle w:val="Prrafodelista"/>
-              <w:spacing w:after="0" w:line="360" w:lineRule="auto"/>
-              <w:ind w:left="0"/>
+              <w:pStyle w:val="Default"/>
+              <w:spacing w:line="360" w:lineRule="auto"/>
               <w:jc w:val="both"/>
               <w:rPr>
-                <w:rFonts w:cstheme="minorHAnsi"/>
-                <w:color w:val="000000" w:themeColor="text1"/>
+                <w:rFonts w:asciiTheme="minorHAnsi" w:hAnsiTheme="minorHAnsi" w:cstheme="minorHAnsi"/>
+                <w:color w:val="000000" w:themeColor="text1"/>
+                <w:sz w:val="22"/>
+                <w:szCs w:val="22"/>
               </w:rPr>
             </w:pPr>
             <w:r>
               <w:rPr>
-                <w:rFonts w:cstheme="minorHAnsi"/>
-                <w:color w:val="000000" w:themeColor="text1"/>
-              </w:rPr>
-              <w:t>Se recomienda que las instalaciones, se mantengan siempre sin llave hasta el cese de actividades diarias, libres de obstáculos.</w:t>
-            </w:r>
-            <w:r>
-              <w:rPr>
-                <w:rFonts w:cstheme="minorHAnsi"/>
-                <w:noProof/>
-                <w:color w:val="000000" w:themeColor="text1"/>
-                <w:lang w:eastAsia="es-MX"/>
-              </w:rPr>
-              <w:t xml:space="preserve">  </w:t>
-            </w:r>
-            <w:r>
-              <w:rPr>
-                <w:rFonts w:cstheme="minorHAnsi"/>
-                <w:color w:val="000000" w:themeColor="text1"/>
-              </w:rPr>
-              <w:t>Revisar la disposición de objetos no empotrados y que puedan volcarse, plafones que presentan humedad, pueden caer o deslizarse en caso de sismo, ubicados en zona de tránsito peatonal, así como la disposición de pesos en su almacenaje.</w:t>
-            </w:r>
-          </w:p>
-        </w:tc>
-        <w:tc>
-          <w:tcPr>
-            <w:tcW w:w="4414" w:type="dxa"/>
-            <w:vAlign w:val="center"/>
-          </w:tcPr>
-          <w:p>
-            <w:pPr>
-              <w:pStyle w:val="Prrafodelista"/>
-              <w:spacing w:after="0" w:line="360" w:lineRule="auto"/>
-              <w:ind w:left="0"/>
-              <w:jc w:val="center"/>
-              <w:rPr>
-                <w:rFonts w:cstheme="minorHAnsi"/>
-                <w:color w:val="000000" w:themeColor="text1"/>
-              </w:rPr>
-            </w:pPr>
-            <w:proofErr w:type="gramStart"/>
-            <w:r>
-              <w:rPr>
-                <w:rFonts w:cstheme="minorHAnsi"/>
-                <w:color w:val="000000" w:themeColor="text1"/>
-              </w:rPr>
-              <w:t>{{ puerta</w:t>
-            </w:r>
-            <w:proofErr w:type="gramEnd"/>
-            <w:r>
-              <w:rPr>
-                <w:rFonts w:cstheme="minorHAnsi"/>
-                <w:color w:val="000000" w:themeColor="text1"/>
-              </w:rPr>
-              <w:t xml:space="preserve"> }}</w:t>
-            </w:r>
-          </w:p>
-        </w:tc>
-      </w:tr>
-      <w:tr>
-        <w:trPr>
-          <w:trHeight w:val="20"/>
-        </w:trPr>
-        <w:tc>
-          <w:tcPr>
-            <w:tcW w:w="4414" w:type="dxa"/>
-            <w:vAlign w:val="center"/>
-          </w:tcPr>
-          <w:p>
-            <w:pPr>
-              <w:pStyle w:val="Prrafodelista"/>
-              <w:spacing w:after="0" w:line="240" w:lineRule="auto"/>
-              <w:ind w:left="0"/>
-              <w:jc w:val="both"/>
-              <w:rPr>
-                <w:rFonts w:cstheme="minorHAnsi"/>
-                <w:color w:val="000000" w:themeColor="text1"/>
-                <w:sz w:val="20"/>
-                <w:szCs w:val="20"/>
-              </w:rPr>
-            </w:pPr>
-          </w:p>
-        </w:tc>
-        <w:tc>
-          <w:tcPr>
-            <w:tcW w:w="4414" w:type="dxa"/>
-            <w:vAlign w:val="center"/>
-          </w:tcPr>
-          <w:p>
-            <w:pPr>
-              <w:pStyle w:val="Prrafodelista"/>
-              <w:spacing w:after="0" w:line="240" w:lineRule="auto"/>
-              <w:ind w:left="0"/>
-              <w:jc w:val="center"/>
-              <w:rPr>
-                <w:rFonts w:cstheme="minorHAnsi"/>
-                <w:color w:val="000000" w:themeColor="text1"/>
-              </w:rPr>
-            </w:pPr>
+                <w:rFonts w:asciiTheme="minorHAnsi" w:hAnsiTheme="minorHAnsi" w:cstheme="minorHAnsi"/>
+                <w:color w:val="000000" w:themeColor="text1"/>
+                <w:sz w:val="22"/>
+                <w:szCs w:val="22"/>
+              </w:rPr>
+              <w:t>La resistencia al fuego de los materiales constitutivos de estructura constructiva del inmueble, cumplen con lo requerida en las normas vigentes, NOM 002 STPS 2010.</w:t>
+            </w:r>
           </w:p>
         </w:tc>
       </w:tr>
@@ -3093,21 +3500,35 @@
           </w:tcPr>
           <w:p>
             <w:pPr>
-              <w:pStyle w:val="Prrafodelista"/>
-              <w:spacing w:after="0" w:line="360" w:lineRule="auto"/>
-              <w:ind w:left="0"/>
-              <w:jc w:val="both"/>
-              <w:rPr>
-                <w:rFonts w:cstheme="minorHAnsi"/>
-                <w:color w:val="000000" w:themeColor="text1"/>
+              <w:pStyle w:val="Default"/>
+              <w:spacing w:line="360" w:lineRule="auto"/>
+              <w:jc w:val="center"/>
+              <w:rPr>
+                <w:rFonts w:asciiTheme="minorHAnsi" w:hAnsiTheme="minorHAnsi" w:cstheme="minorHAnsi"/>
+                <w:color w:val="000000" w:themeColor="text1"/>
+                <w:sz w:val="22"/>
+                <w:szCs w:val="22"/>
               </w:rPr>
             </w:pPr>
-            <w:r>
-              <w:rPr>
-                <w:rFonts w:cstheme="minorHAnsi"/>
-                <w:color w:val="000000" w:themeColor="text1"/>
-              </w:rPr>
-              <w:t>La estantería se encuentra bien empotrada con material colocado de acuerdo con peso, con bordes romos sin riesgo para los usuarios.</w:t>
+            <w:proofErr w:type="gramStart"/>
+            <w:r>
+              <w:rPr>
+                <w:rFonts w:asciiTheme="minorHAnsi" w:hAnsiTheme="minorHAnsi" w:cstheme="minorHAnsi"/>
+                <w:color w:val="000000" w:themeColor="text1"/>
+                <w:sz w:val="22"/>
+                <w:szCs w:val="22"/>
+              </w:rPr>
+              <w:t>{{ mueble</w:t>
+            </w:r>
+            <w:proofErr w:type="gramEnd"/>
+            <w:r>
+              <w:rPr>
+                <w:rFonts w:asciiTheme="minorHAnsi" w:hAnsiTheme="minorHAnsi" w:cstheme="minorHAnsi"/>
+                <w:color w:val="000000" w:themeColor="text1"/>
+                <w:sz w:val="22"/>
+                <w:szCs w:val="22"/>
+              </w:rPr>
+              <w:t>1 }}</w:t>
             </w:r>
           </w:p>
         </w:tc>
@@ -3118,35 +3539,61 @@
           </w:tcPr>
           <w:p>
             <w:pPr>
-              <w:pStyle w:val="Prrafodelista"/>
-              <w:spacing w:after="0" w:line="360" w:lineRule="auto"/>
-              <w:ind w:left="0"/>
+              <w:pStyle w:val="Default"/>
+              <w:spacing w:line="360" w:lineRule="auto"/>
               <w:jc w:val="center"/>
               <w:rPr>
-                <w:rFonts w:cstheme="minorHAnsi"/>
-                <w:color w:val="000000" w:themeColor="text1"/>
+                <w:rFonts w:asciiTheme="minorHAnsi" w:hAnsiTheme="minorHAnsi" w:cstheme="minorHAnsi"/>
+                <w:color w:val="000000" w:themeColor="text1"/>
+                <w:sz w:val="22"/>
+                <w:szCs w:val="22"/>
               </w:rPr>
             </w:pPr>
             <w:proofErr w:type="gramStart"/>
             <w:r>
               <w:rPr>
-                <w:rFonts w:cstheme="minorHAnsi"/>
-                <w:color w:val="000000" w:themeColor="text1"/>
-              </w:rPr>
-              <w:t>{{ estantes</w:t>
+                <w:rFonts w:asciiTheme="minorHAnsi" w:hAnsiTheme="minorHAnsi" w:cstheme="minorHAnsi"/>
+                <w:color w:val="000000" w:themeColor="text1"/>
+                <w:sz w:val="22"/>
+                <w:szCs w:val="22"/>
+              </w:rPr>
+              <w:t xml:space="preserve">{{ </w:t>
+            </w:r>
+            <w:r>
+              <w:rPr>
+                <w:rFonts w:asciiTheme="minorHAnsi" w:hAnsiTheme="minorHAnsi" w:cstheme="minorHAnsi"/>
+                <w:color w:val="000000" w:themeColor="text1"/>
+                <w:sz w:val="22"/>
+                <w:szCs w:val="22"/>
+              </w:rPr>
+              <w:t>in</w:t>
+            </w:r>
+            <w:r>
+              <w:rPr>
+                <w:rFonts w:asciiTheme="minorHAnsi" w:hAnsiTheme="minorHAnsi" w:cstheme="minorHAnsi"/>
+                <w:color w:val="000000" w:themeColor="text1"/>
+                <w:sz w:val="22"/>
+                <w:szCs w:val="22"/>
+              </w:rPr>
+              <w:t>mueble</w:t>
             </w:r>
             <w:proofErr w:type="gramEnd"/>
             <w:r>
               <w:rPr>
-                <w:rFonts w:cstheme="minorHAnsi"/>
-                <w:color w:val="000000" w:themeColor="text1"/>
-              </w:rPr>
-              <w:t xml:space="preserve"> }}</w:t>
+                <w:rFonts w:asciiTheme="minorHAnsi" w:hAnsiTheme="minorHAnsi" w:cstheme="minorHAnsi"/>
+                <w:color w:val="000000" w:themeColor="text1"/>
+                <w:sz w:val="22"/>
+                <w:szCs w:val="22"/>
+              </w:rPr>
+              <w:t>1 }}</w:t>
             </w:r>
           </w:p>
         </w:tc>
       </w:tr>
       <w:tr>
+        <w:trPr>
+          <w:trHeight w:val="57"/>
+        </w:trPr>
         <w:tc>
           <w:tcPr>
             <w:tcW w:w="4414" w:type="dxa"/>
@@ -3154,11 +3601,11 @@
           </w:tcPr>
           <w:p>
             <w:pPr>
-              <w:pStyle w:val="Prrafodelista"/>
-              <w:spacing w:after="0" w:line="240" w:lineRule="auto"/>
-              <w:ind w:left="0"/>
+              <w:pStyle w:val="Default"/>
               <w:jc w:val="both"/>
               <w:rPr>
+                <w:rFonts w:asciiTheme="minorHAnsi" w:hAnsiTheme="minorHAnsi" w:cstheme="minorHAnsi"/>
+                <w:color w:val="000000" w:themeColor="text1"/>
                 <w:sz w:val="20"/>
                 <w:szCs w:val="20"/>
               </w:rPr>
@@ -3172,15 +3619,67 @@
           </w:tcPr>
           <w:p>
             <w:pPr>
-              <w:pStyle w:val="Prrafodelista"/>
-              <w:spacing w:after="0" w:line="240" w:lineRule="auto"/>
-              <w:ind w:left="0"/>
+              <w:pStyle w:val="Default"/>
               <w:jc w:val="center"/>
               <w:rPr>
+                <w:rFonts w:asciiTheme="minorHAnsi" w:hAnsiTheme="minorHAnsi" w:cstheme="minorHAnsi"/>
+                <w:color w:val="000000" w:themeColor="text1"/>
                 <w:sz w:val="20"/>
                 <w:szCs w:val="20"/>
               </w:rPr>
             </w:pPr>
+          </w:p>
+        </w:tc>
+      </w:tr>
+      <w:tr>
+        <w:trPr>
+          <w:trHeight w:val="1701"/>
+        </w:trPr>
+        <w:tc>
+          <w:tcPr>
+            <w:tcW w:w="8828" w:type="dxa"/>
+            <w:gridSpan w:val="2"/>
+            <w:vAlign w:val="center"/>
+          </w:tcPr>
+          <w:p>
+            <w:pPr>
+              <w:pStyle w:val="Default"/>
+              <w:spacing w:line="360" w:lineRule="auto"/>
+              <w:rPr>
+                <w:rFonts w:asciiTheme="minorHAnsi" w:hAnsiTheme="minorHAnsi" w:cstheme="minorHAnsi"/>
+                <w:color w:val="000000" w:themeColor="text1"/>
+                <w:sz w:val="22"/>
+                <w:szCs w:val="22"/>
+              </w:rPr>
+            </w:pPr>
+            <w:r>
+              <w:rPr>
+                <w:rFonts w:asciiTheme="minorHAnsi" w:hAnsiTheme="minorHAnsi" w:cstheme="minorHAnsi"/>
+                <w:color w:val="000000" w:themeColor="text1"/>
+                <w:sz w:val="22"/>
+                <w:szCs w:val="22"/>
+              </w:rPr>
+              <w:t>Instalación eléctrica maneja voltaje de 110 volts, se encuentran dentro de canaleta, no presenta cableado provisional,</w:t>
+            </w:r>
+            <w:r>
+              <w:rPr>
+                <w:rFonts w:asciiTheme="minorHAnsi" w:hAnsiTheme="minorHAnsi" w:cstheme="minorHAnsi"/>
+                <w:noProof/>
+                <w:color w:val="000000" w:themeColor="text1"/>
+                <w:sz w:val="22"/>
+                <w:szCs w:val="22"/>
+              </w:rPr>
+              <w:t xml:space="preserve"> </w:t>
+            </w:r>
+            <w:r>
+              <w:rPr>
+                <w:rFonts w:asciiTheme="minorHAnsi" w:hAnsiTheme="minorHAnsi" w:cstheme="minorHAnsi"/>
+                <w:color w:val="000000" w:themeColor="text1"/>
+                <w:sz w:val="22"/>
+                <w:szCs w:val="22"/>
+              </w:rPr>
+              <w:t>mismo que se realiza evitando riesgos.</w:t>
+            </w:r>
           </w:p>
         </w:tc>
       </w:tr>
@@ -3195,33 +3694,47 @@
           </w:tcPr>
           <w:p>
             <w:pPr>
-              <w:pStyle w:val="Prrafodelista"/>
-              <w:spacing w:after="0" w:line="360" w:lineRule="auto"/>
-              <w:ind w:left="0"/>
-              <w:jc w:val="both"/>
+              <w:pStyle w:val="Default"/>
+              <w:spacing w:line="360" w:lineRule="auto"/>
+              <w:ind w:right="-60"/>
+              <w:jc w:val="center"/>
+              <w:rPr>
+                <w:rFonts w:asciiTheme="minorHAnsi" w:hAnsiTheme="minorHAnsi" w:cstheme="minorHAnsi"/>
+                <w:color w:val="000000" w:themeColor="text1"/>
+                <w:sz w:val="22"/>
+                <w:szCs w:val="22"/>
+              </w:rPr>
             </w:pPr>
-            <w:r>
-              <w:rPr>
-                <w:rFonts w:cstheme="minorHAnsi"/>
-                <w:color w:val="000000" w:themeColor="text1"/>
-              </w:rPr>
-              <w:t xml:space="preserve">El site se encuentra restringido en su acceso, limpio de almacenaje de combustibles sólidos y otros, con detector de humo vigente, toda la instalación eléctrica bajo resguardo tubo </w:t>
+            <w:proofErr w:type="gramStart"/>
+            <w:r>
+              <w:rPr>
+                <w:rFonts w:asciiTheme="minorHAnsi" w:hAnsiTheme="minorHAnsi" w:cstheme="minorHAnsi"/>
+                <w:color w:val="000000" w:themeColor="text1"/>
+                <w:sz w:val="22"/>
+                <w:szCs w:val="22"/>
+              </w:rPr>
+              <w:t xml:space="preserve">{{ </w:t>
             </w:r>
             <w:proofErr w:type="spellStart"/>
             <w:r>
               <w:rPr>
-                <w:rFonts w:cstheme="minorHAnsi"/>
-                <w:color w:val="000000" w:themeColor="text1"/>
-              </w:rPr>
-              <w:t>conduit</w:t>
+                <w:rFonts w:asciiTheme="minorHAnsi" w:hAnsiTheme="minorHAnsi" w:cstheme="minorHAnsi"/>
+                <w:color w:val="000000" w:themeColor="text1"/>
+                <w:sz w:val="22"/>
+                <w:szCs w:val="22"/>
+              </w:rPr>
+              <w:t>electrico</w:t>
             </w:r>
             <w:proofErr w:type="spellEnd"/>
-            <w:r>
-              <w:rPr>
-                <w:rFonts w:cstheme="minorHAnsi"/>
-                <w:color w:val="000000" w:themeColor="text1"/>
-              </w:rPr>
-              <w:t>, señalizado en sus tableros de control, con sistema de ventilación adecuado.</w:t>
+            <w:proofErr w:type="gramEnd"/>
+            <w:r>
+              <w:rPr>
+                <w:rFonts w:asciiTheme="minorHAnsi" w:hAnsiTheme="minorHAnsi" w:cstheme="minorHAnsi"/>
+                <w:color w:val="000000" w:themeColor="text1"/>
+                <w:sz w:val="22"/>
+                <w:szCs w:val="22"/>
+              </w:rPr>
+              <w:t xml:space="preserve"> }}</w:t>
             </w:r>
           </w:p>
         </w:tc>
@@ -3232,28 +3745,42 @@
           </w:tcPr>
           <w:p>
             <w:pPr>
-              <w:pStyle w:val="Prrafodelista"/>
-              <w:spacing w:after="0" w:line="360" w:lineRule="auto"/>
-              <w:ind w:left="0"/>
+              <w:pStyle w:val="Default"/>
+              <w:spacing w:line="360" w:lineRule="auto"/>
               <w:jc w:val="center"/>
               <w:rPr>
-                <w:rFonts w:cstheme="minorHAnsi"/>
-                <w:color w:val="000000" w:themeColor="text1"/>
+                <w:rFonts w:asciiTheme="minorHAnsi" w:hAnsiTheme="minorHAnsi" w:cstheme="minorHAnsi"/>
+                <w:color w:val="000000" w:themeColor="text1"/>
+                <w:sz w:val="22"/>
+                <w:szCs w:val="22"/>
               </w:rPr>
             </w:pPr>
             <w:proofErr w:type="gramStart"/>
             <w:r>
               <w:rPr>
-                <w:rFonts w:cstheme="minorHAnsi"/>
-                <w:color w:val="000000" w:themeColor="text1"/>
-              </w:rPr>
-              <w:t>{{ site</w:t>
+                <w:rFonts w:asciiTheme="minorHAnsi" w:hAnsiTheme="minorHAnsi" w:cstheme="minorHAnsi"/>
+                <w:color w:val="000000" w:themeColor="text1"/>
+                <w:sz w:val="22"/>
+                <w:szCs w:val="22"/>
+              </w:rPr>
+              <w:t>{{ electrico</w:t>
             </w:r>
             <w:proofErr w:type="gramEnd"/>
             <w:r>
               <w:rPr>
-                <w:rFonts w:cstheme="minorHAnsi"/>
-                <w:color w:val="000000" w:themeColor="text1"/>
+                <w:rFonts w:asciiTheme="minorHAnsi" w:hAnsiTheme="minorHAnsi" w:cstheme="minorHAnsi"/>
+                <w:color w:val="000000" w:themeColor="text1"/>
+                <w:sz w:val="22"/>
+                <w:szCs w:val="22"/>
+              </w:rPr>
+              <w:t>1</w:t>
+            </w:r>
+            <w:r>
+              <w:rPr>
+                <w:rFonts w:asciiTheme="minorHAnsi" w:hAnsiTheme="minorHAnsi" w:cstheme="minorHAnsi"/>
+                <w:color w:val="000000" w:themeColor="text1"/>
+                <w:sz w:val="22"/>
+                <w:szCs w:val="22"/>
               </w:rPr>
               <w:t xml:space="preserve"> }}</w:t>
             </w:r>
@@ -3266,34 +3793,29 @@
         <w:rPr>
           <w:rFonts w:cstheme="minorHAnsi"/>
           <w:color w:val="000000" w:themeColor="text1"/>
-          <w:kern w:val="0"/>
-          <w14:ligatures w14:val="none"/>
+        </w:rPr>
+      </w:pPr>
+    </w:p>
+    <w:p>
+      <w:pPr>
+        <w:rPr>
+          <w:rFonts w:cstheme="minorHAnsi"/>
+          <w:color w:val="000000" w:themeColor="text1"/>
         </w:rPr>
       </w:pPr>
       <w:r>
         <w:rPr>
           <w:rFonts w:cstheme="minorHAnsi"/>
           <w:color w:val="000000" w:themeColor="text1"/>
-          <w:kern w:val="0"/>
-          <w14:ligatures w14:val="none"/>
         </w:rPr>
         <w:br w:type="page"/>
       </w:r>
-    </w:p>
-    <w:p>
-      <w:pPr>
-        <w:rPr>
-          <w:rFonts w:cstheme="minorHAnsi"/>
-          <w:color w:val="000000" w:themeColor="text1"/>
-          <w:kern w:val="0"/>
-          <w14:ligatures w14:val="none"/>
-        </w:rPr>
-      </w:pPr>
     </w:p>
     <w:tbl>
       <w:tblPr>
         <w:tblStyle w:val="Tablaconcuadrcula"/>
         <w:tblW w:w="0" w:type="auto"/>
+        <w:tblInd w:w="-5" w:type="dxa"/>
         <w:tblBorders>
           <w:top w:val="none" w:sz="0" w:space="0" w:color="auto"/>
           <w:left w:val="none" w:sz="0" w:space="0" w:color="auto"/>
@@ -3310,6 +3832,144 @@
       </w:tblGrid>
       <w:tr>
         <w:trPr>
+          <w:trHeight w:val="1701"/>
+        </w:trPr>
+        <w:tc>
+          <w:tcPr>
+            <w:tcW w:w="8828" w:type="dxa"/>
+            <w:gridSpan w:val="2"/>
+            <w:vAlign w:val="center"/>
+          </w:tcPr>
+          <w:p>
+            <w:pPr>
+              <w:pStyle w:val="Default"/>
+              <w:spacing w:line="360" w:lineRule="auto"/>
+              <w:rPr>
+                <w:rFonts w:asciiTheme="minorHAnsi" w:hAnsiTheme="minorHAnsi" w:cstheme="minorHAnsi"/>
+                <w:color w:val="000000" w:themeColor="text1"/>
+                <w:sz w:val="22"/>
+                <w:szCs w:val="22"/>
+              </w:rPr>
+            </w:pPr>
+            <w:r>
+              <w:rPr>
+                <w:rFonts w:asciiTheme="minorHAnsi" w:hAnsiTheme="minorHAnsi" w:cstheme="minorHAnsi"/>
+                <w:color w:val="000000" w:themeColor="text1"/>
+                <w:sz w:val="22"/>
+                <w:szCs w:val="22"/>
+              </w:rPr>
+              <w:lastRenderedPageBreak/>
+              <w:t>Los sanitarios se encuentran higiénicos y sanitizados, con medidas acorde a la población usuarios. Evitar el transvase en productos de limpieza y preferentemente utilizar sustancias con las mismas propiedades químicas, pero menos peligrosas para la salud durante su aseo.</w:t>
+            </w:r>
+          </w:p>
+        </w:tc>
+      </w:tr>
+      <w:tr>
+        <w:trPr>
+          <w:trHeight w:val="3288"/>
+        </w:trPr>
+        <w:tc>
+          <w:tcPr>
+            <w:tcW w:w="4414" w:type="dxa"/>
+            <w:vAlign w:val="center"/>
+          </w:tcPr>
+          <w:p>
+            <w:pPr>
+              <w:pStyle w:val="Default"/>
+              <w:spacing w:line="360" w:lineRule="auto"/>
+              <w:ind w:right="-60"/>
+              <w:jc w:val="center"/>
+              <w:rPr>
+                <w:rFonts w:asciiTheme="minorHAnsi" w:hAnsiTheme="minorHAnsi" w:cstheme="minorHAnsi"/>
+                <w:color w:val="000000" w:themeColor="text1"/>
+                <w:sz w:val="22"/>
+                <w:szCs w:val="22"/>
+              </w:rPr>
+            </w:pPr>
+            <w:proofErr w:type="gramStart"/>
+            <w:r>
+              <w:rPr>
+                <w:rFonts w:asciiTheme="minorHAnsi" w:hAnsiTheme="minorHAnsi" w:cstheme="minorHAnsi"/>
+                <w:color w:val="000000" w:themeColor="text1"/>
+                <w:sz w:val="22"/>
+                <w:szCs w:val="22"/>
+              </w:rPr>
+              <w:t xml:space="preserve">{{ </w:t>
+            </w:r>
+            <w:proofErr w:type="spellStart"/>
+            <w:r>
+              <w:rPr>
+                <w:rFonts w:asciiTheme="minorHAnsi" w:hAnsiTheme="minorHAnsi" w:cstheme="minorHAnsi"/>
+                <w:color w:val="000000" w:themeColor="text1"/>
+                <w:sz w:val="22"/>
+                <w:szCs w:val="22"/>
+              </w:rPr>
+              <w:t>banio</w:t>
+            </w:r>
+            <w:proofErr w:type="spellEnd"/>
+            <w:proofErr w:type="gramEnd"/>
+            <w:r>
+              <w:rPr>
+                <w:rFonts w:asciiTheme="minorHAnsi" w:hAnsiTheme="minorHAnsi" w:cstheme="minorHAnsi"/>
+                <w:color w:val="000000" w:themeColor="text1"/>
+                <w:sz w:val="22"/>
+                <w:szCs w:val="22"/>
+              </w:rPr>
+              <w:t xml:space="preserve"> }}</w:t>
+            </w:r>
+          </w:p>
+        </w:tc>
+        <w:tc>
+          <w:tcPr>
+            <w:tcW w:w="4414" w:type="dxa"/>
+            <w:vAlign w:val="center"/>
+          </w:tcPr>
+          <w:p>
+            <w:pPr>
+              <w:pStyle w:val="Default"/>
+              <w:spacing w:line="360" w:lineRule="auto"/>
+              <w:jc w:val="center"/>
+              <w:rPr>
+                <w:rFonts w:asciiTheme="minorHAnsi" w:hAnsiTheme="minorHAnsi" w:cstheme="minorHAnsi"/>
+                <w:color w:val="000000" w:themeColor="text1"/>
+                <w:sz w:val="22"/>
+                <w:szCs w:val="22"/>
+              </w:rPr>
+            </w:pPr>
+            <w:proofErr w:type="gramStart"/>
+            <w:r>
+              <w:rPr>
+                <w:rFonts w:asciiTheme="minorHAnsi" w:hAnsiTheme="minorHAnsi" w:cstheme="minorHAnsi"/>
+                <w:color w:val="000000" w:themeColor="text1"/>
+                <w:sz w:val="22"/>
+                <w:szCs w:val="22"/>
+              </w:rPr>
+              <w:t>{{ banio</w:t>
+            </w:r>
+            <w:proofErr w:type="gramEnd"/>
+            <w:r>
+              <w:rPr>
+                <w:rFonts w:asciiTheme="minorHAnsi" w:hAnsiTheme="minorHAnsi" w:cstheme="minorHAnsi"/>
+                <w:color w:val="000000" w:themeColor="text1"/>
+                <w:sz w:val="22"/>
+                <w:szCs w:val="22"/>
+              </w:rPr>
+              <w:t>1</w:t>
+            </w:r>
+            <w:r>
+              <w:rPr>
+                <w:rFonts w:asciiTheme="minorHAnsi" w:hAnsiTheme="minorHAnsi" w:cstheme="minorHAnsi"/>
+                <w:color w:val="000000" w:themeColor="text1"/>
+                <w:sz w:val="22"/>
+                <w:szCs w:val="22"/>
+              </w:rPr>
+              <w:t xml:space="preserve"> }}</w:t>
+            </w:r>
+          </w:p>
+        </w:tc>
+      </w:tr>
+      <w:tr>
+        <w:trPr>
           <w:trHeight w:val="3288"/>
         </w:trPr>
         <w:tc>
@@ -3423,7 +4083,25 @@
                 <w:sz w:val="22"/>
                 <w:szCs w:val="22"/>
               </w:rPr>
-              <w:t xml:space="preserve"> litros. Se con los dictámenes correspondientes que garantizan su correcta instalación y operación.</w:t>
+              <w:t xml:space="preserve"> litros. Se </w:t>
+            </w:r>
+            <w:r>
+              <w:rPr>
+                <w:rFonts w:asciiTheme="minorHAnsi" w:hAnsiTheme="minorHAnsi" w:cstheme="minorHAnsi"/>
+                <w:color w:val="000000" w:themeColor="text1"/>
+                <w:sz w:val="22"/>
+                <w:szCs w:val="22"/>
+              </w:rPr>
+              <w:t xml:space="preserve">cuenta </w:t>
+            </w:r>
+            <w:r>
+              <w:rPr>
+                <w:rFonts w:asciiTheme="minorHAnsi" w:hAnsiTheme="minorHAnsi" w:cstheme="minorHAnsi"/>
+                <w:color w:val="000000" w:themeColor="text1"/>
+                <w:sz w:val="22"/>
+                <w:szCs w:val="22"/>
+              </w:rPr>
+              <w:t>con los dictámenes correspondientes que garantizan su correcta instalación y operación.</w:t>
             </w:r>
           </w:p>
         </w:tc>
@@ -3555,61 +4233,7 @@
                 <w:sz w:val="22"/>
                 <w:szCs w:val="22"/>
               </w:rPr>
-              <w:t xml:space="preserve">Las válvulas de gas </w:t>
-            </w:r>
-            <w:r>
-              <w:rPr>
-                <w:rFonts w:asciiTheme="minorHAnsi" w:hAnsiTheme="minorHAnsi" w:cstheme="minorHAnsi"/>
-                <w:color w:val="000000" w:themeColor="text1"/>
-                <w:sz w:val="22"/>
-                <w:szCs w:val="22"/>
-              </w:rPr>
-              <w:t xml:space="preserve">se encuentran </w:t>
-            </w:r>
-            <w:r>
-              <w:rPr>
-                <w:rFonts w:asciiTheme="minorHAnsi" w:hAnsiTheme="minorHAnsi" w:cstheme="minorHAnsi"/>
-                <w:color w:val="000000" w:themeColor="text1"/>
-                <w:sz w:val="22"/>
-                <w:szCs w:val="22"/>
-              </w:rPr>
-              <w:t>en buenas condiciones no presentan fugas, corrosión</w:t>
-            </w:r>
-            <w:r>
-              <w:rPr>
-                <w:rFonts w:asciiTheme="minorHAnsi" w:hAnsiTheme="minorHAnsi" w:cstheme="minorHAnsi"/>
-                <w:color w:val="000000" w:themeColor="text1"/>
-                <w:sz w:val="22"/>
-                <w:szCs w:val="22"/>
-              </w:rPr>
-              <w:t>,</w:t>
-            </w:r>
-            <w:r>
-              <w:rPr>
-                <w:rFonts w:asciiTheme="minorHAnsi" w:hAnsiTheme="minorHAnsi" w:cstheme="minorHAnsi"/>
-                <w:color w:val="000000" w:themeColor="text1"/>
-                <w:sz w:val="22"/>
-                <w:szCs w:val="22"/>
-              </w:rPr>
-              <w:t xml:space="preserve"> ni obstrucciones; operan con facilidad</w:t>
-            </w:r>
-            <w:r>
-              <w:rPr>
-                <w:rFonts w:asciiTheme="minorHAnsi" w:hAnsiTheme="minorHAnsi" w:cstheme="minorHAnsi"/>
-                <w:color w:val="000000" w:themeColor="text1"/>
-                <w:sz w:val="22"/>
-                <w:szCs w:val="22"/>
-              </w:rPr>
-              <w:t xml:space="preserve"> y </w:t>
-            </w:r>
-            <w:r>
-              <w:rPr>
-                <w:rFonts w:asciiTheme="minorHAnsi" w:hAnsiTheme="minorHAnsi" w:cstheme="minorHAnsi"/>
-                <w:color w:val="000000" w:themeColor="text1"/>
-                <w:sz w:val="22"/>
-                <w:szCs w:val="22"/>
-              </w:rPr>
-              <w:t>sellan correctamente</w:t>
+              <w:t>Las válvulas de gas se encuentran en buenas condiciones no presentan fugas, corrosión, ni obstrucciones; operan con facilidad y sellan correctamente</w:t>
             </w:r>
           </w:p>
         </w:tc>
@@ -3713,14 +4337,6 @@
         </w:tc>
       </w:tr>
     </w:tbl>
-    <w:p>
-      <w:pPr>
-        <w:rPr>
-          <w:rFonts w:cstheme="minorHAnsi"/>
-          <w:color w:val="000000" w:themeColor="text1"/>
-        </w:rPr>
-      </w:pPr>
-    </w:p>
     <w:p/>
     <w:p>
       <w:pPr>

</xml_diff>